<commit_message>
Small changes to wording and straightened out variable names
</commit_message>
<xml_diff>
--- a/docassemble/MAEmergencyHousingRelief/data/templates/verified_complaint_and_request_for.docx
+++ b/docassemble/MAEmergencyHousingRelief/data/templates/verified_complaint_and_request_for.docx
@@ -246,15 +246,7 @@
                 <w:sz w:val="18"/>
                 <w:szCs w:val="18"/>
               </w:rPr>
-              <w:t>DOCKET NO. (FOR COURT USE ONLY</w:t>
-            </w:r>
-            <w:r>
-              <w:rPr>
-                <w:rFonts w:ascii="Times New Roman" w:hAnsi="Times New Roman" w:eastAsia="Times New Roman" w:cs="Times New Roman"/>
-                <w:sz w:val="18"/>
-                <w:szCs w:val="18"/>
-              </w:rPr>
-              <w:t>)</w:t>
+              <w:t>DOCKET NO. (FOR COURT USE ONLY)</w:t>
             </w:r>
           </w:p>
         </w:tc>
@@ -334,23 +326,7 @@
                 <w:sz w:val="18"/>
                 <w:szCs w:val="18"/>
               </w:rPr>
-              <w:t>COURT</w:t>
-            </w:r>
-            <w:r>
-              <w:rPr>
-                <w:rFonts w:ascii="Times New Roman" w:hAnsi="Times New Roman" w:eastAsia="Times New Roman" w:cs="Times New Roman"/>
-                <w:sz w:val="18"/>
-                <w:szCs w:val="18"/>
-              </w:rPr>
-              <w:t xml:space="preserve"> </w:t>
-            </w:r>
-            <w:r>
-              <w:rPr>
-                <w:rFonts w:ascii="Times New Roman" w:hAnsi="Times New Roman" w:eastAsia="Times New Roman" w:cs="Times New Roman"/>
-                <w:sz w:val="18"/>
-                <w:szCs w:val="18"/>
-              </w:rPr>
-              <w:t>DIVISION/COUNTY</w:t>
+              <w:t xml:space="preserve">COURT DIVISION/COUNTY</w:t>
             </w:r>
           </w:p>
           <w:p>
@@ -369,23 +345,7 @@
                 <w:sz w:val="18"/>
                 <w:szCs w:val="18"/>
               </w:rPr>
-              <w:t xml:space="preserve">{{ </w:t>
-            </w:r>
-            <w:r>
-              <w:rPr>
-                <w:rFonts w:ascii="Times New Roman" w:hAnsi="Times New Roman" w:eastAsia="Times New Roman" w:cs="Times New Roman"/>
-                <w:sz w:val="18"/>
-                <w:szCs w:val="18"/>
-              </w:rPr>
-              <w:t>trial_court</w:t>
-            </w:r>
-            <w:r>
-              <w:rPr>
-                <w:rFonts w:ascii="Times New Roman" w:hAnsi="Times New Roman" w:eastAsia="Times New Roman" w:cs="Times New Roman"/>
-                <w:sz w:val="18"/>
-                <w:szCs w:val="18"/>
-              </w:rPr>
-              <w:t xml:space="preserve"> }}</w:t>
+              <w:t xml:space="preserve">{{ trial_court }}</w:t>
             </w:r>
           </w:p>
         </w:tc>
@@ -438,13 +398,13 @@
                 <w:u w:val="none"/>
                 <w:lang w:val="en-GB"/>
               </w:rPr>
-              <w:t xml:space="preserve">DO </w:t>
-            </w:r>
-            <w:r>
-              <w:rPr>
-                <w:rFonts w:ascii="Times New Roman" w:hAnsi="Times New Roman" w:eastAsia="Times New Roman" w:cs="Times New Roman"/>
-                <w:b w:val="1"/>
-                <w:bCs w:val="1"/>
+              <w:t xml:space="preserve">DO YOU HAVE A SUMMARY PROCESS (EVICTION CASE)</w:t>
+            </w:r>
+            <w:r>
+              <w:rPr>
+                <w:rFonts w:ascii="Times New Roman" w:hAnsi="Times New Roman" w:eastAsia="Times New Roman" w:cs="Times New Roman"/>
+                <w:b w:val="0"/>
+                <w:bCs w:val="0"/>
                 <w:i w:val="0"/>
                 <w:iCs w:val="0"/>
                 <w:strike w:val="0"/>
@@ -456,7 +416,7 @@
                 <w:u w:val="none"/>
                 <w:lang w:val="en-GB"/>
               </w:rPr>
-              <w:t>YOU HAVE A SUMM</w:t>
+              <w:t xml:space="preserve"> {{ output_checkbox(eviction_case_yes) }} </w:t>
             </w:r>
             <w:r>
               <w:rPr>
@@ -474,13 +434,13 @@
                 <w:u w:val="none"/>
                 <w:lang w:val="en-GB"/>
               </w:rPr>
-              <w:t>A</w:t>
-            </w:r>
-            <w:r>
-              <w:rPr>
-                <w:rFonts w:ascii="Times New Roman" w:hAnsi="Times New Roman" w:eastAsia="Times New Roman" w:cs="Times New Roman"/>
-                <w:b w:val="1"/>
-                <w:bCs w:val="1"/>
+              <w:t xml:space="preserve">Yes </w:t>
+            </w:r>
+            <w:r>
+              <w:rPr>
+                <w:rFonts w:ascii="Times New Roman" w:hAnsi="Times New Roman" w:eastAsia="Times New Roman" w:cs="Times New Roman"/>
+                <w:b w:val="0"/>
+                <w:bCs w:val="0"/>
                 <w:i w:val="0"/>
                 <w:iCs w:val="0"/>
                 <w:strike w:val="0"/>
@@ -492,7 +452,7 @@
                 <w:u w:val="none"/>
                 <w:lang w:val="en-GB"/>
               </w:rPr>
-              <w:t>RY PROCESS (E</w:t>
+              <w:t xml:space="preserve">{{ output_checkbox(eviction_case_no) }}</w:t>
             </w:r>
             <w:r>
               <w:rPr>
@@ -510,313 +470,7 @@
                 <w:u w:val="none"/>
                 <w:lang w:val="en-GB"/>
               </w:rPr>
-              <w:t>VIC</w:t>
-            </w:r>
-            <w:r>
-              <w:rPr>
-                <w:rFonts w:ascii="Times New Roman" w:hAnsi="Times New Roman" w:eastAsia="Times New Roman" w:cs="Times New Roman"/>
-                <w:b w:val="1"/>
-                <w:bCs w:val="1"/>
-                <w:i w:val="0"/>
-                <w:iCs w:val="0"/>
-                <w:strike w:val="0"/>
-                <w:dstrike w:val="0"/>
-                <w:noProof w:val="0"/>
-                <w:color w:val="000000" w:themeColor="text1" w:themeTint="FF" w:themeShade="FF"/>
-                <w:sz w:val="18"/>
-                <w:szCs w:val="18"/>
-                <w:u w:val="none"/>
-                <w:lang w:val="en-GB"/>
-              </w:rPr>
-              <w:t>TION CASE)</w:t>
-            </w:r>
-            <w:r>
-              <w:rPr>
-                <w:rFonts w:ascii="Times New Roman" w:hAnsi="Times New Roman" w:eastAsia="Times New Roman" w:cs="Times New Roman"/>
-                <w:b w:val="0"/>
-                <w:bCs w:val="0"/>
-                <w:i w:val="0"/>
-                <w:iCs w:val="0"/>
-                <w:strike w:val="0"/>
-                <w:dstrike w:val="0"/>
-                <w:noProof w:val="0"/>
-                <w:color w:val="000000" w:themeColor="text1" w:themeTint="FF" w:themeShade="FF"/>
-                <w:sz w:val="18"/>
-                <w:szCs w:val="18"/>
-                <w:u w:val="none"/>
-                <w:lang w:val="en-GB"/>
-              </w:rPr>
-              <w:t xml:space="preserve"> </w:t>
-            </w:r>
-            <w:r>
-              <w:rPr>
-                <w:rFonts w:ascii="Times New Roman" w:hAnsi="Times New Roman" w:eastAsia="Times New Roman" w:cs="Times New Roman"/>
-                <w:b w:val="0"/>
-                <w:bCs w:val="0"/>
-                <w:i w:val="0"/>
-                <w:iCs w:val="0"/>
-                <w:strike w:val="0"/>
-                <w:dstrike w:val="0"/>
-                <w:noProof w:val="0"/>
-                <w:color w:val="000000" w:themeColor="text1" w:themeTint="FF" w:themeShade="FF"/>
-                <w:sz w:val="18"/>
-                <w:szCs w:val="18"/>
-                <w:u w:val="none"/>
-                <w:lang w:val="en-GB"/>
-              </w:rPr>
-              <w:t xml:space="preserve">{{ </w:t>
-            </w:r>
-            <w:r>
-              <w:rPr>
-                <w:rFonts w:ascii="Times New Roman" w:hAnsi="Times New Roman" w:eastAsia="Times New Roman" w:cs="Times New Roman"/>
-                <w:b w:val="0"/>
-                <w:bCs w:val="0"/>
-                <w:i w:val="0"/>
-                <w:iCs w:val="0"/>
-                <w:strike w:val="0"/>
-                <w:dstrike w:val="0"/>
-                <w:noProof w:val="0"/>
-                <w:color w:val="000000" w:themeColor="text1" w:themeTint="FF" w:themeShade="FF"/>
-                <w:sz w:val="18"/>
-                <w:szCs w:val="18"/>
-                <w:u w:val="none"/>
-                <w:lang w:val="en-GB"/>
-              </w:rPr>
-              <w:t>output_checkbox</w:t>
-            </w:r>
-            <w:r>
-              <w:rPr>
-                <w:rFonts w:ascii="Times New Roman" w:hAnsi="Times New Roman" w:eastAsia="Times New Roman" w:cs="Times New Roman"/>
-                <w:b w:val="0"/>
-                <w:bCs w:val="0"/>
-                <w:i w:val="0"/>
-                <w:iCs w:val="0"/>
-                <w:strike w:val="0"/>
-                <w:dstrike w:val="0"/>
-                <w:noProof w:val="0"/>
-                <w:color w:val="000000" w:themeColor="text1" w:themeTint="FF" w:themeShade="FF"/>
-                <w:sz w:val="18"/>
-                <w:szCs w:val="18"/>
-                <w:u w:val="none"/>
-                <w:lang w:val="en-GB"/>
-              </w:rPr>
-              <w:t>(</w:t>
-            </w:r>
-            <w:r>
-              <w:rPr>
-                <w:rFonts w:ascii="Times New Roman" w:hAnsi="Times New Roman" w:eastAsia="Times New Roman" w:cs="Times New Roman"/>
-                <w:b w:val="0"/>
-                <w:bCs w:val="0"/>
-                <w:i w:val="0"/>
-                <w:iCs w:val="0"/>
-                <w:strike w:val="0"/>
-                <w:dstrike w:val="0"/>
-                <w:noProof w:val="0"/>
-                <w:color w:val="000000" w:themeColor="text1" w:themeTint="FF" w:themeShade="FF"/>
-                <w:sz w:val="18"/>
-                <w:szCs w:val="18"/>
-                <w:u w:val="none"/>
-                <w:lang w:val="en-GB"/>
-              </w:rPr>
-              <w:t>eviction_case_yes</w:t>
-            </w:r>
-            <w:r>
-              <w:rPr>
-                <w:rFonts w:ascii="Times New Roman" w:hAnsi="Times New Roman" w:eastAsia="Times New Roman" w:cs="Times New Roman"/>
-                <w:b w:val="0"/>
-                <w:bCs w:val="0"/>
-                <w:i w:val="0"/>
-                <w:iCs w:val="0"/>
-                <w:strike w:val="0"/>
-                <w:dstrike w:val="0"/>
-                <w:noProof w:val="0"/>
-                <w:color w:val="000000" w:themeColor="text1" w:themeTint="FF" w:themeShade="FF"/>
-                <w:sz w:val="18"/>
-                <w:szCs w:val="18"/>
-                <w:u w:val="none"/>
-                <w:lang w:val="en-GB"/>
-              </w:rPr>
-              <w:t>) }</w:t>
-            </w:r>
-            <w:r>
-              <w:rPr>
-                <w:rFonts w:ascii="Times New Roman" w:hAnsi="Times New Roman" w:eastAsia="Times New Roman" w:cs="Times New Roman"/>
-                <w:b w:val="0"/>
-                <w:bCs w:val="0"/>
-                <w:i w:val="0"/>
-                <w:iCs w:val="0"/>
-                <w:strike w:val="0"/>
-                <w:dstrike w:val="0"/>
-                <w:noProof w:val="0"/>
-                <w:color w:val="000000" w:themeColor="text1" w:themeTint="FF" w:themeShade="FF"/>
-                <w:sz w:val="18"/>
-                <w:szCs w:val="18"/>
-                <w:u w:val="none"/>
-                <w:lang w:val="en-GB"/>
-              </w:rPr>
-              <w:t xml:space="preserve">} </w:t>
-            </w:r>
-            <w:r>
-              <w:rPr>
-                <w:rFonts w:ascii="Times New Roman" w:hAnsi="Times New Roman" w:eastAsia="Times New Roman" w:cs="Times New Roman"/>
-                <w:b w:val="1"/>
-                <w:bCs w:val="1"/>
-                <w:i w:val="0"/>
-                <w:iCs w:val="0"/>
-                <w:strike w:val="0"/>
-                <w:dstrike w:val="0"/>
-                <w:noProof w:val="0"/>
-                <w:color w:val="000000" w:themeColor="text1" w:themeTint="FF" w:themeShade="FF"/>
-                <w:sz w:val="18"/>
-                <w:szCs w:val="18"/>
-                <w:u w:val="none"/>
-                <w:lang w:val="en-GB"/>
-              </w:rPr>
-              <w:t xml:space="preserve">Yes </w:t>
-            </w:r>
-            <w:r>
-              <w:rPr>
-                <w:rFonts w:ascii="Times New Roman" w:hAnsi="Times New Roman" w:eastAsia="Times New Roman" w:cs="Times New Roman"/>
-                <w:b w:val="0"/>
-                <w:bCs w:val="0"/>
-                <w:i w:val="0"/>
-                <w:iCs w:val="0"/>
-                <w:strike w:val="0"/>
-                <w:dstrike w:val="0"/>
-                <w:noProof w:val="0"/>
-                <w:color w:val="000000" w:themeColor="text1" w:themeTint="FF" w:themeShade="FF"/>
-                <w:sz w:val="18"/>
-                <w:szCs w:val="18"/>
-                <w:u w:val="none"/>
-                <w:lang w:val="en-GB"/>
-              </w:rPr>
-              <w:t xml:space="preserve">{{ </w:t>
-            </w:r>
-            <w:r>
-              <w:rPr>
-                <w:rFonts w:ascii="Times New Roman" w:hAnsi="Times New Roman" w:eastAsia="Times New Roman" w:cs="Times New Roman"/>
-                <w:b w:val="0"/>
-                <w:bCs w:val="0"/>
-                <w:i w:val="0"/>
-                <w:iCs w:val="0"/>
-                <w:strike w:val="0"/>
-                <w:dstrike w:val="0"/>
-                <w:noProof w:val="0"/>
-                <w:color w:val="000000" w:themeColor="text1" w:themeTint="FF" w:themeShade="FF"/>
-                <w:sz w:val="18"/>
-                <w:szCs w:val="18"/>
-                <w:u w:val="none"/>
-                <w:lang w:val="en-GB"/>
-              </w:rPr>
-              <w:t>output_checkbox</w:t>
-            </w:r>
-            <w:r>
-              <w:rPr>
-                <w:rFonts w:ascii="Times New Roman" w:hAnsi="Times New Roman" w:eastAsia="Times New Roman" w:cs="Times New Roman"/>
-                <w:b w:val="0"/>
-                <w:bCs w:val="0"/>
-                <w:i w:val="0"/>
-                <w:iCs w:val="0"/>
-                <w:strike w:val="0"/>
-                <w:dstrike w:val="0"/>
-                <w:noProof w:val="0"/>
-                <w:color w:val="000000" w:themeColor="text1" w:themeTint="FF" w:themeShade="FF"/>
-                <w:sz w:val="18"/>
-                <w:szCs w:val="18"/>
-                <w:u w:val="none"/>
-                <w:lang w:val="en-GB"/>
-              </w:rPr>
-              <w:t>(</w:t>
-            </w:r>
-            <w:r>
-              <w:rPr>
-                <w:rFonts w:ascii="Times New Roman" w:hAnsi="Times New Roman" w:eastAsia="Times New Roman" w:cs="Times New Roman"/>
-                <w:b w:val="0"/>
-                <w:bCs w:val="0"/>
-                <w:i w:val="0"/>
-                <w:iCs w:val="0"/>
-                <w:strike w:val="0"/>
-                <w:dstrike w:val="0"/>
-                <w:noProof w:val="0"/>
-                <w:color w:val="000000" w:themeColor="text1" w:themeTint="FF" w:themeShade="FF"/>
-                <w:sz w:val="18"/>
-                <w:szCs w:val="18"/>
-                <w:u w:val="none"/>
-                <w:lang w:val="en-GB"/>
-              </w:rPr>
-              <w:t>eviction_case_no</w:t>
-            </w:r>
-            <w:r>
-              <w:rPr>
-                <w:rFonts w:ascii="Times New Roman" w:hAnsi="Times New Roman" w:eastAsia="Times New Roman" w:cs="Times New Roman"/>
-                <w:b w:val="0"/>
-                <w:bCs w:val="0"/>
-                <w:i w:val="0"/>
-                <w:iCs w:val="0"/>
-                <w:strike w:val="0"/>
-                <w:dstrike w:val="0"/>
-                <w:noProof w:val="0"/>
-                <w:color w:val="000000" w:themeColor="text1" w:themeTint="FF" w:themeShade="FF"/>
-                <w:sz w:val="18"/>
-                <w:szCs w:val="18"/>
-                <w:u w:val="none"/>
-                <w:lang w:val="en-GB"/>
-              </w:rPr>
-              <w:t>) }</w:t>
-            </w:r>
-            <w:r>
-              <w:rPr>
-                <w:rFonts w:ascii="Times New Roman" w:hAnsi="Times New Roman" w:eastAsia="Times New Roman" w:cs="Times New Roman"/>
-                <w:b w:val="0"/>
-                <w:bCs w:val="0"/>
-                <w:i w:val="0"/>
-                <w:iCs w:val="0"/>
-                <w:strike w:val="0"/>
-                <w:dstrike w:val="0"/>
-                <w:noProof w:val="0"/>
-                <w:color w:val="000000" w:themeColor="text1" w:themeTint="FF" w:themeShade="FF"/>
-                <w:sz w:val="18"/>
-                <w:szCs w:val="18"/>
-                <w:u w:val="none"/>
-                <w:lang w:val="en-GB"/>
-              </w:rPr>
-              <w:t>}</w:t>
-            </w:r>
-            <w:r>
-              <w:rPr>
-                <w:rFonts w:ascii="Times New Roman" w:hAnsi="Times New Roman" w:eastAsia="Times New Roman" w:cs="Times New Roman"/>
-                <w:b w:val="1"/>
-                <w:bCs w:val="1"/>
-                <w:i w:val="0"/>
-                <w:iCs w:val="0"/>
-                <w:strike w:val="0"/>
-                <w:dstrike w:val="0"/>
-                <w:noProof w:val="0"/>
-                <w:color w:val="000000" w:themeColor="text1" w:themeTint="FF" w:themeShade="FF"/>
-                <w:sz w:val="18"/>
-                <w:szCs w:val="18"/>
-                <w:u w:val="none"/>
-                <w:lang w:val="en-GB"/>
-              </w:rPr>
-              <w:t xml:space="preserve"> </w:t>
-            </w:r>
-            <w:r>
-              <w:rPr>
-                <w:rFonts w:ascii="Times New Roman" w:hAnsi="Times New Roman" w:eastAsia="Times New Roman" w:cs="Times New Roman"/>
-                <w:b w:val="1"/>
-                <w:bCs w:val="1"/>
-                <w:i w:val="0"/>
-                <w:iCs w:val="0"/>
-                <w:strike w:val="0"/>
-                <w:dstrike w:val="0"/>
-                <w:noProof w:val="0"/>
-                <w:color w:val="000000" w:themeColor="text1" w:themeTint="FF" w:themeShade="FF"/>
-                <w:sz w:val="18"/>
-                <w:szCs w:val="18"/>
-                <w:u w:val="none"/>
-                <w:lang w:val="en-GB"/>
-              </w:rPr>
-              <w:t>No</w:t>
+              <w:t xml:space="preserve"> No</w:t>
             </w:r>
           </w:p>
         </w:tc>
@@ -850,17 +504,7 @@
                 <w:sz w:val="18"/>
                 <w:szCs w:val="18"/>
               </w:rPr>
-              <w:t xml:space="preserve">DOCKET NO. </w:t>
-            </w:r>
-            <w:r>
-              <w:rPr>
-                <w:rFonts w:ascii="Times New Roman" w:hAnsi="Times New Roman" w:eastAsia="Times New Roman" w:cs="Times New Roman"/>
-                <w:b w:val="1"/>
-                <w:bCs w:val="1"/>
-                <w:sz w:val="18"/>
-                <w:szCs w:val="18"/>
-              </w:rPr>
-              <w:t xml:space="preserve">{{ </w:t>
+              <w:t xml:space="preserve">DOCKET NO. {{ </w:t>
             </w:r>
             <w:r>
               <w:rPr>
@@ -915,31 +559,7 @@
                 <w:sz w:val="18"/>
                 <w:szCs w:val="18"/>
               </w:rPr>
-              <w:t xml:space="preserve">Plaintiff(s)</w:t>
-            </w:r>
-            <w:r>
-              <w:rPr>
-                <w:rFonts w:ascii="Times New Roman" w:hAnsi="Times New Roman" w:eastAsia="Times New Roman" w:cs="Times New Roman"/>
-                <w:sz w:val="18"/>
-                <w:szCs w:val="18"/>
-              </w:rPr>
-              <w:t xml:space="preserve">:  </w:t>
-            </w:r>
-            <w:r>
-              <w:rPr>
-                <w:rFonts w:ascii="Times New Roman" w:hAnsi="Times New Roman" w:eastAsia="Times New Roman" w:cs="Times New Roman"/>
-                <w:sz w:val="18"/>
-                <w:szCs w:val="18"/>
-              </w:rPr>
-              <w:t xml:space="preserve">{</w:t>
-            </w:r>
-            <w:r>
-              <w:rPr>
-                <w:rFonts w:ascii="Times New Roman" w:hAnsi="Times New Roman" w:eastAsia="Times New Roman" w:cs="Times New Roman"/>
-                <w:sz w:val="18"/>
-                <w:szCs w:val="18"/>
-              </w:rPr>
-              <w:t xml:space="preserve">{ </w:t>
+              <w:t xml:space="preserve">Plaintiff(s):  {{ </w:t>
             </w:r>
             <w:r>
               <w:rPr>
@@ -948,7 +568,34 @@
                 <w:szCs w:val="18"/>
                 <w:shd w:val="clear" w:color="auto" w:fill="C7E1DD"/>
               </w:rPr>
-              <w:t>plaintiffs</w:t>
+              <w:t>plaintiffs[0].name.full()</w:t>
+            </w:r>
+            <w:r>
+              <w:rPr>
+                <w:rFonts w:ascii="Times New Roman" w:hAnsi="Times New Roman" w:eastAsia="Times New Roman" w:cs="Times New Roman"/>
+                <w:sz w:val="18"/>
+                <w:szCs w:val="18"/>
+              </w:rPr>
+              <w:t xml:space="preserve"> }}</w:t>
+            </w:r>
+          </w:p>
+          <w:p>
+            <w:pPr>
+              <w:pStyle w:val="Normal"/>
+              <w:spacing w:line="360" w:lineRule="auto"/>
+              <w:rPr>
+                <w:rFonts w:ascii="Times New Roman" w:hAnsi="Times New Roman" w:eastAsia="Times New Roman" w:cs="Times New Roman"/>
+                <w:sz w:val="18"/>
+                <w:szCs w:val="18"/>
+              </w:rPr>
+            </w:pPr>
+            <w:r>
+              <w:rPr>
+                <w:rFonts w:ascii="Times New Roman" w:hAnsi="Times New Roman" w:eastAsia="Times New Roman" w:cs="Times New Roman"/>
+                <w:sz w:val="18"/>
+                <w:szCs w:val="18"/>
+              </w:rPr>
+              <w:t xml:space="preserve">Address: {{ </w:t>
             </w:r>
             <w:r>
               <w:rPr>
@@ -957,7 +604,34 @@
                 <w:szCs w:val="18"/>
                 <w:shd w:val="clear" w:color="auto" w:fill="C7E1DD"/>
               </w:rPr>
-              <w:t>[0</w:t>
+              <w:t>plaintiffs[0].address.line_one()</w:t>
+            </w:r>
+            <w:r>
+              <w:rPr>
+                <w:rFonts w:ascii="Times New Roman" w:hAnsi="Times New Roman" w:eastAsia="Times New Roman" w:cs="Times New Roman"/>
+                <w:sz w:val="18"/>
+                <w:szCs w:val="18"/>
+              </w:rPr>
+              <w:t xml:space="preserve"> }}</w:t>
+            </w:r>
+          </w:p>
+          <w:p>
+            <w:pPr>
+              <w:pStyle w:val="Normal"/>
+              <w:spacing w:line="360" w:lineRule="auto"/>
+              <w:rPr>
+                <w:rFonts w:ascii="Times New Roman" w:hAnsi="Times New Roman" w:eastAsia="Times New Roman" w:cs="Times New Roman"/>
+                <w:sz w:val="18"/>
+                <w:szCs w:val="18"/>
+              </w:rPr>
+            </w:pPr>
+            <w:r>
+              <w:rPr>
+                <w:rFonts w:ascii="Times New Roman" w:hAnsi="Times New Roman" w:eastAsia="Times New Roman" w:cs="Times New Roman"/>
+                <w:sz w:val="18"/>
+                <w:szCs w:val="18"/>
+              </w:rPr>
+              <w:t xml:space="preserve">City: {{ </w:t>
             </w:r>
             <w:r>
               <w:rPr>
@@ -966,7 +640,34 @@
                 <w:szCs w:val="18"/>
                 <w:shd w:val="clear" w:color="auto" w:fill="C7E1DD"/>
               </w:rPr>
-              <w:t>]</w:t>
+              <w:t>plaintiffs[0].address.city</w:t>
+            </w:r>
+            <w:r>
+              <w:rPr>
+                <w:rFonts w:ascii="Times New Roman" w:hAnsi="Times New Roman" w:eastAsia="Times New Roman" w:cs="Times New Roman"/>
+                <w:sz w:val="18"/>
+                <w:szCs w:val="18"/>
+              </w:rPr>
+              <w:t xml:space="preserve"> }}</w:t>
+            </w:r>
+          </w:p>
+          <w:p>
+            <w:pPr>
+              <w:pStyle w:val="Normal"/>
+              <w:spacing w:line="360" w:lineRule="auto"/>
+              <w:rPr>
+                <w:rFonts w:ascii="Times New Roman" w:hAnsi="Times New Roman" w:eastAsia="Times New Roman" w:cs="Times New Roman"/>
+                <w:sz w:val="18"/>
+                <w:szCs w:val="18"/>
+              </w:rPr>
+            </w:pPr>
+            <w:r>
+              <w:rPr>
+                <w:rFonts w:ascii="Times New Roman" w:hAnsi="Times New Roman" w:eastAsia="Times New Roman" w:cs="Times New Roman"/>
+                <w:sz w:val="18"/>
+                <w:szCs w:val="18"/>
+              </w:rPr>
+              <w:t xml:space="preserve">Phone: {{ </w:t>
             </w:r>
             <w:r>
               <w:rPr>
@@ -975,23 +676,15 @@
                 <w:szCs w:val="18"/>
                 <w:shd w:val="clear" w:color="auto" w:fill="C7E1DD"/>
               </w:rPr>
-              <w:t>.name.full()</w:t>
-            </w:r>
-            <w:r>
-              <w:rPr>
-                <w:rFonts w:ascii="Times New Roman" w:hAnsi="Times New Roman" w:eastAsia="Times New Roman" w:cs="Times New Roman"/>
-                <w:sz w:val="18"/>
-                <w:szCs w:val="18"/>
-              </w:rPr>
-              <w:t xml:space="preserve"> }</w:t>
-            </w:r>
-            <w:r>
-              <w:rPr>
-                <w:rFonts w:ascii="Times New Roman" w:hAnsi="Times New Roman" w:eastAsia="Times New Roman" w:cs="Times New Roman"/>
-                <w:sz w:val="18"/>
-                <w:szCs w:val="18"/>
-              </w:rPr>
-              <w:t xml:space="preserve">}</w:t>
+              <w:t>plaintiffs[0].phone_number</w:t>
+            </w:r>
+            <w:r>
+              <w:rPr>
+                <w:rFonts w:ascii="Times New Roman" w:hAnsi="Times New Roman" w:eastAsia="Times New Roman" w:cs="Times New Roman"/>
+                <w:sz w:val="18"/>
+                <w:szCs w:val="18"/>
+              </w:rPr>
+              <w:t xml:space="preserve"> }}</w:t>
             </w:r>
           </w:p>
           <w:p>
@@ -1010,147 +703,7 @@
                 <w:sz w:val="18"/>
                 <w:szCs w:val="18"/>
               </w:rPr>
-              <w:t xml:space="preserve">Address: </w:t>
-            </w:r>
-            <w:r>
-              <w:rPr>
-                <w:rFonts w:ascii="Times New Roman" w:hAnsi="Times New Roman" w:eastAsia="Times New Roman" w:cs="Times New Roman"/>
-                <w:sz w:val="18"/>
-                <w:szCs w:val="18"/>
-              </w:rPr>
-              <w:t xml:space="preserve">{{ </w:t>
-            </w:r>
-            <w:r>
-              <w:rPr>
-                <w:rFonts w:ascii="Times New Roman" w:hAnsi="Times New Roman" w:eastAsia="Times New Roman" w:cs="Times New Roman"/>
-                <w:sz w:val="18"/>
-                <w:szCs w:val="18"/>
-                <w:shd w:val="clear" w:color="auto" w:fill="C7E1DD"/>
-              </w:rPr>
-              <w:t>plaintiffs[0].address.line_one()</w:t>
-            </w:r>
-            <w:r>
-              <w:rPr>
-                <w:rFonts w:ascii="Times New Roman" w:hAnsi="Times New Roman" w:eastAsia="Times New Roman" w:cs="Times New Roman"/>
-                <w:sz w:val="18"/>
-                <w:szCs w:val="18"/>
-              </w:rPr>
-              <w:t xml:space="preserve"> }}</w:t>
-            </w:r>
-          </w:p>
-          <w:p>
-            <w:pPr>
-              <w:pStyle w:val="Normal"/>
-              <w:spacing w:line="360" w:lineRule="auto"/>
-              <w:rPr>
-                <w:rFonts w:ascii="Times New Roman" w:hAnsi="Times New Roman" w:eastAsia="Times New Roman" w:cs="Times New Roman"/>
-                <w:sz w:val="18"/>
-                <w:szCs w:val="18"/>
-              </w:rPr>
-            </w:pPr>
-            <w:r>
-              <w:rPr>
-                <w:rFonts w:ascii="Times New Roman" w:hAnsi="Times New Roman" w:eastAsia="Times New Roman" w:cs="Times New Roman"/>
-                <w:sz w:val="18"/>
-                <w:szCs w:val="18"/>
-              </w:rPr>
-              <w:t xml:space="preserve">City: </w:t>
-            </w:r>
-            <w:r>
-              <w:rPr>
-                <w:rFonts w:ascii="Times New Roman" w:hAnsi="Times New Roman" w:eastAsia="Times New Roman" w:cs="Times New Roman"/>
-                <w:sz w:val="18"/>
-                <w:szCs w:val="18"/>
-              </w:rPr>
-              <w:t xml:space="preserve">{{ </w:t>
-            </w:r>
-            <w:r>
-              <w:rPr>
-                <w:rFonts w:ascii="Times New Roman" w:hAnsi="Times New Roman" w:eastAsia="Times New Roman" w:cs="Times New Roman"/>
-                <w:sz w:val="18"/>
-                <w:szCs w:val="18"/>
-                <w:shd w:val="clear" w:color="auto" w:fill="C7E1DD"/>
-              </w:rPr>
-              <w:t>plaintiffs[0].address.city</w:t>
-            </w:r>
-            <w:r>
-              <w:rPr>
-                <w:rFonts w:ascii="Times New Roman" w:hAnsi="Times New Roman" w:eastAsia="Times New Roman" w:cs="Times New Roman"/>
-                <w:sz w:val="18"/>
-                <w:szCs w:val="18"/>
-              </w:rPr>
-              <w:t xml:space="preserve"> }}</w:t>
-            </w:r>
-          </w:p>
-          <w:p>
-            <w:pPr>
-              <w:pStyle w:val="Normal"/>
-              <w:spacing w:line="360" w:lineRule="auto"/>
-              <w:rPr>
-                <w:rFonts w:ascii="Times New Roman" w:hAnsi="Times New Roman" w:eastAsia="Times New Roman" w:cs="Times New Roman"/>
-                <w:sz w:val="18"/>
-                <w:szCs w:val="18"/>
-              </w:rPr>
-            </w:pPr>
-            <w:r>
-              <w:rPr>
-                <w:rFonts w:ascii="Times New Roman" w:hAnsi="Times New Roman" w:eastAsia="Times New Roman" w:cs="Times New Roman"/>
-                <w:sz w:val="18"/>
-                <w:szCs w:val="18"/>
-              </w:rPr>
-              <w:t xml:space="preserve">Phone: </w:t>
-            </w:r>
-            <w:r>
-              <w:rPr>
-                <w:rFonts w:ascii="Times New Roman" w:hAnsi="Times New Roman" w:eastAsia="Times New Roman" w:cs="Times New Roman"/>
-                <w:sz w:val="18"/>
-                <w:szCs w:val="18"/>
-              </w:rPr>
-              <w:t xml:space="preserve">{{ </w:t>
-            </w:r>
-            <w:r>
-              <w:rPr>
-                <w:rFonts w:ascii="Times New Roman" w:hAnsi="Times New Roman" w:eastAsia="Times New Roman" w:cs="Times New Roman"/>
-                <w:sz w:val="18"/>
-                <w:szCs w:val="18"/>
-                <w:shd w:val="clear" w:color="auto" w:fill="C7E1DD"/>
-              </w:rPr>
-              <w:t>plaintiffs[0].phone_number</w:t>
-            </w:r>
-            <w:r>
-              <w:rPr>
-                <w:rFonts w:ascii="Times New Roman" w:hAnsi="Times New Roman" w:eastAsia="Times New Roman" w:cs="Times New Roman"/>
-                <w:sz w:val="18"/>
-                <w:szCs w:val="18"/>
-              </w:rPr>
-              <w:t xml:space="preserve"> }}</w:t>
-            </w:r>
-          </w:p>
-          <w:p>
-            <w:pPr>
-              <w:pStyle w:val="Normal"/>
-              <w:spacing w:line="360" w:lineRule="auto"/>
-              <w:rPr>
-                <w:rFonts w:ascii="Times New Roman" w:hAnsi="Times New Roman" w:eastAsia="Times New Roman" w:cs="Times New Roman"/>
-                <w:sz w:val="18"/>
-                <w:szCs w:val="18"/>
-              </w:rPr>
-            </w:pPr>
-            <w:r>
-              <w:rPr>
-                <w:rFonts w:ascii="Times New Roman" w:hAnsi="Times New Roman" w:eastAsia="Times New Roman" w:cs="Times New Roman"/>
-                <w:sz w:val="18"/>
-                <w:szCs w:val="18"/>
-              </w:rPr>
-              <w:t xml:space="preserve">Email: </w:t>
-            </w:r>
-            <w:r>
-              <w:rPr>
-                <w:rFonts w:ascii="Times New Roman" w:hAnsi="Times New Roman" w:eastAsia="Times New Roman" w:cs="Times New Roman"/>
-                <w:sz w:val="18"/>
-                <w:szCs w:val="18"/>
-              </w:rPr>
-              <w:t xml:space="preserve">{{ </w:t>
+              <w:t xml:space="preserve">Email: {{ </w:t>
             </w:r>
             <w:r>
               <w:rPr>
@@ -1197,15 +750,7 @@
                 <w:sz w:val="18"/>
                 <w:szCs w:val="18"/>
               </w:rPr>
-              <w:t xml:space="preserve">Defendant(s): </w:t>
-            </w:r>
-            <w:r>
-              <w:rPr>
-                <w:rFonts w:ascii="Times New Roman" w:hAnsi="Times New Roman" w:eastAsia="Times New Roman" w:cs="Times New Roman"/>
-                <w:sz w:val="18"/>
-                <w:szCs w:val="18"/>
-              </w:rPr>
-              <w:t xml:space="preserve">{{ </w:t>
+              <w:t xml:space="preserve">Defendant(s): {{ </w:t>
             </w:r>
             <w:r>
               <w:rPr>
@@ -1241,15 +786,7 @@
                 <w:sz w:val="18"/>
                 <w:szCs w:val="18"/>
               </w:rPr>
-              <w:t xml:space="preserve">Address: </w:t>
-            </w:r>
-            <w:r>
-              <w:rPr>
-                <w:rFonts w:ascii="Times New Roman" w:hAnsi="Times New Roman" w:eastAsia="Times New Roman" w:cs="Times New Roman"/>
-                <w:sz w:val="18"/>
-                <w:szCs w:val="18"/>
-              </w:rPr>
-              <w:t xml:space="preserve">{{ </w:t>
+              <w:t xml:space="preserve">Address: {{ </w:t>
             </w:r>
             <w:r>
               <w:rPr>
@@ -1285,15 +822,7 @@
                 <w:sz w:val="18"/>
                 <w:szCs w:val="18"/>
               </w:rPr>
-              <w:t xml:space="preserve">City: </w:t>
-            </w:r>
-            <w:r>
-              <w:rPr>
-                <w:rFonts w:ascii="Times New Roman" w:hAnsi="Times New Roman" w:eastAsia="Times New Roman" w:cs="Times New Roman"/>
-                <w:sz w:val="18"/>
-                <w:szCs w:val="18"/>
-              </w:rPr>
-              <w:t xml:space="preserve">{{ </w:t>
+              <w:t xml:space="preserve">City: {{ </w:t>
             </w:r>
             <w:r>
               <w:rPr>
@@ -1329,15 +858,7 @@
                 <w:sz w:val="18"/>
                 <w:szCs w:val="18"/>
               </w:rPr>
-              <w:t xml:space="preserve">Phone: </w:t>
-            </w:r>
-            <w:r>
-              <w:rPr>
-                <w:rFonts w:ascii="Times New Roman" w:hAnsi="Times New Roman" w:eastAsia="Times New Roman" w:cs="Times New Roman"/>
-                <w:sz w:val="18"/>
-                <w:szCs w:val="18"/>
-              </w:rPr>
-              <w:t xml:space="preserve">{{ </w:t>
+              <w:t xml:space="preserve">Phone: {{ </w:t>
             </w:r>
             <w:r>
               <w:rPr>
@@ -1373,15 +894,7 @@
                 <w:sz w:val="18"/>
                 <w:szCs w:val="18"/>
               </w:rPr>
-              <w:t xml:space="preserve">Email: </w:t>
-            </w:r>
-            <w:r>
-              <w:rPr>
-                <w:rFonts w:ascii="Times New Roman" w:hAnsi="Times New Roman" w:eastAsia="Times New Roman" w:cs="Times New Roman"/>
-                <w:sz w:val="18"/>
-                <w:szCs w:val="18"/>
-              </w:rPr>
-              <w:t xml:space="preserve">{{ </w:t>
+              <w:t xml:space="preserve">Email: {{ </w:t>
             </w:r>
             <w:r>
               <w:rPr>
@@ -1448,15 +961,7 @@
                 <w:sz w:val="18"/>
                 <w:szCs w:val="18"/>
               </w:rPr>
-              <w:t xml:space="preserve">{{</w:t>
-            </w:r>
-            <w:r>
-              <w:rPr>
-                <w:rFonts w:ascii="Times New Roman" w:hAnsi="Times New Roman" w:eastAsia="Times New Roman" w:cs="Times New Roman"/>
-                <w:sz w:val="18"/>
-                <w:szCs w:val="18"/>
-              </w:rPr>
-              <w:t xml:space="preserve"> </w:t>
+              <w:t xml:space="preserve">{{ </w:t>
             </w:r>
             <w:r>
               <w:rPr>
@@ -1473,15 +978,7 @@
                 <w:sz w:val="18"/>
                 <w:szCs w:val="18"/>
               </w:rPr>
-              <w:t xml:space="preserve"> </w:t>
-            </w:r>
-            <w:r>
-              <w:rPr>
-                <w:rFonts w:ascii="Times New Roman" w:hAnsi="Times New Roman" w:eastAsia="Times New Roman" w:cs="Times New Roman"/>
-                <w:sz w:val="18"/>
-                <w:szCs w:val="18"/>
-              </w:rPr>
-              <w:t xml:space="preserve">}}</w:t>
+              <w:t xml:space="preserve"> }}</w:t>
             </w:r>
           </w:p>
         </w:tc>
@@ -1561,9 +1058,13 @@
                 <w:szCs w:val="18"/>
                 <w:u w:val="none"/>
               </w:rPr>
-              <w:t xml:space="preserve">{{ </w:t>
-            </w:r>
-            <w:r>
+              <w:t xml:space="preserve">{{ output_checkbox(violation_breach_contract) }} Breach of contract (for example: lease agreement) </w:t>
+            </w:r>
+          </w:p>
+          <w:p>
+            <w:pPr>
+              <w:pStyle w:val="Normal"/>
+              <w:spacing w:before="0" w:beforeAutospacing="off" w:after="0" w:afterAutospacing="off" w:line="360" w:lineRule="auto"/>
               <w:rPr>
                 <w:rFonts w:ascii="Times New Roman" w:hAnsi="Times New Roman" w:eastAsia="Times New Roman" w:cs="Times New Roman"/>
                 <w:b w:val="0"/>
@@ -1577,8 +1078,7 @@
                 <w:szCs w:val="18"/>
                 <w:u w:val="none"/>
               </w:rPr>
-              <w:t>output_checkbox</w:t>
-            </w:r>
+            </w:pPr>
             <w:r>
               <w:rPr>
                 <w:rFonts w:ascii="Times New Roman" w:hAnsi="Times New Roman" w:eastAsia="Times New Roman" w:cs="Times New Roman"/>
@@ -1593,122 +1093,7 @@
                 <w:szCs w:val="18"/>
                 <w:u w:val="none"/>
               </w:rPr>
-              <w:t>(</w:t>
-            </w:r>
-            <w:r>
-              <w:rPr>
-                <w:rFonts w:ascii="Times New Roman" w:hAnsi="Times New Roman" w:eastAsia="Times New Roman" w:cs="Times New Roman"/>
-                <w:b w:val="0"/>
-                <w:bCs w:val="0"/>
-                <w:i w:val="0"/>
-                <w:iCs w:val="0"/>
-                <w:strike w:val="0"/>
-                <w:dstrike w:val="0"/>
-                <w:color w:val="000000" w:themeColor="text1" w:themeTint="FF" w:themeShade="FF"/>
-                <w:sz w:val="18"/>
-                <w:szCs w:val="18"/>
-                <w:u w:val="none"/>
-              </w:rPr>
-              <w:t>violation_breach_contract</w:t>
-            </w:r>
-            <w:r>
-              <w:rPr>
-                <w:rFonts w:ascii="Times New Roman" w:hAnsi="Times New Roman" w:eastAsia="Times New Roman" w:cs="Times New Roman"/>
-                <w:b w:val="0"/>
-                <w:bCs w:val="0"/>
-                <w:i w:val="0"/>
-                <w:iCs w:val="0"/>
-                <w:strike w:val="0"/>
-                <w:dstrike w:val="0"/>
-                <w:color w:val="000000" w:themeColor="text1" w:themeTint="FF" w:themeShade="FF"/>
-                <w:sz w:val="18"/>
-                <w:szCs w:val="18"/>
-                <w:u w:val="none"/>
-              </w:rPr>
-              <w:t>) }</w:t>
-            </w:r>
-            <w:r>
-              <w:rPr>
-                <w:rFonts w:ascii="Times New Roman" w:hAnsi="Times New Roman" w:eastAsia="Times New Roman" w:cs="Times New Roman"/>
-                <w:b w:val="0"/>
-                <w:bCs w:val="0"/>
-                <w:i w:val="0"/>
-                <w:iCs w:val="0"/>
-                <w:strike w:val="0"/>
-                <w:dstrike w:val="0"/>
-                <w:color w:val="000000" w:themeColor="text1" w:themeTint="FF" w:themeShade="FF"/>
-                <w:sz w:val="18"/>
-                <w:szCs w:val="18"/>
-                <w:u w:val="none"/>
-              </w:rPr>
-              <w:t xml:space="preserve">} Breach of contract (for example: lease agreement) </w:t>
-            </w:r>
-          </w:p>
-          <w:p>
-            <w:pPr>
-              <w:pStyle w:val="Normal"/>
-              <w:spacing w:before="0" w:beforeAutospacing="off" w:after="0" w:afterAutospacing="off" w:line="360" w:lineRule="auto"/>
-              <w:rPr>
-                <w:rFonts w:ascii="Times New Roman" w:hAnsi="Times New Roman" w:eastAsia="Times New Roman" w:cs="Times New Roman"/>
-                <w:b w:val="0"/>
-                <w:bCs w:val="0"/>
-                <w:i w:val="0"/>
-                <w:iCs w:val="0"/>
-                <w:strike w:val="0"/>
-                <w:dstrike w:val="0"/>
-                <w:color w:val="000000" w:themeColor="text1" w:themeTint="FF" w:themeShade="FF"/>
-                <w:sz w:val="18"/>
-                <w:szCs w:val="18"/>
-                <w:u w:val="none"/>
-              </w:rPr>
-            </w:pPr>
-            <w:r>
-              <w:rPr>
-                <w:rFonts w:ascii="Times New Roman" w:hAnsi="Times New Roman" w:eastAsia="Times New Roman" w:cs="Times New Roman"/>
-                <w:b w:val="0"/>
-                <w:bCs w:val="0"/>
-                <w:i w:val="0"/>
-                <w:iCs w:val="0"/>
-                <w:strike w:val="0"/>
-                <w:dstrike w:val="0"/>
-                <w:color w:val="000000" w:themeColor="text1" w:themeTint="FF" w:themeShade="FF"/>
-                <w:sz w:val="18"/>
-                <w:szCs w:val="18"/>
-                <w:u w:val="none"/>
-              </w:rPr>
-              <w:t xml:space="preserve">{{ </w:t>
-            </w:r>
-            <w:r>
-              <w:rPr>
-                <w:rFonts w:ascii="Times New Roman" w:hAnsi="Times New Roman" w:eastAsia="Times New Roman" w:cs="Times New Roman"/>
-                <w:b w:val="0"/>
-                <w:bCs w:val="0"/>
-                <w:i w:val="0"/>
-                <w:iCs w:val="0"/>
-                <w:strike w:val="0"/>
-                <w:dstrike w:val="0"/>
-                <w:color w:val="000000" w:themeColor="text1" w:themeTint="FF" w:themeShade="FF"/>
-                <w:sz w:val="18"/>
-                <w:szCs w:val="18"/>
-                <w:u w:val="none"/>
-              </w:rPr>
-              <w:t>output_checkbox</w:t>
-            </w:r>
-            <w:r>
-              <w:rPr>
-                <w:rFonts w:ascii="Times New Roman" w:hAnsi="Times New Roman" w:eastAsia="Times New Roman" w:cs="Times New Roman"/>
-                <w:b w:val="0"/>
-                <w:bCs w:val="0"/>
-                <w:i w:val="0"/>
-                <w:iCs w:val="0"/>
-                <w:strike w:val="0"/>
-                <w:dstrike w:val="0"/>
-                <w:color w:val="000000" w:themeColor="text1" w:themeTint="FF" w:themeShade="FF"/>
-                <w:sz w:val="18"/>
-                <w:szCs w:val="18"/>
-                <w:u w:val="none"/>
-              </w:rPr>
-              <w:t>(</w:t>
+              <w:t xml:space="preserve">{{ output_checkbox(</w:t>
             </w:r>
             <w:r>
               <w:rPr>
@@ -1726,7 +1111,7 @@
                 <w:u w:val="none"/>
                 <w:lang w:val="en-GB"/>
               </w:rPr>
-              <w:t>utilities_needed</w:t>
+              <w:t>violation_utilities</w:t>
             </w:r>
             <w:r>
               <w:rPr>
@@ -1742,9 +1127,12 @@
                 <w:szCs w:val="18"/>
                 <w:u w:val="none"/>
               </w:rPr>
-              <w:t>) }</w:t>
-            </w:r>
-            <w:r>
+              <w:t xml:space="preserve">) }} Interference with utilities or services (for example: breach of covenant of quiet enjoyment) </w:t>
+            </w:r>
+          </w:p>
+          <w:p>
+            <w:pPr>
+              <w:spacing w:before="0" w:beforeAutospacing="off" w:after="0" w:afterAutospacing="off" w:line="360" w:lineRule="auto"/>
               <w:rPr>
                 <w:rFonts w:ascii="Times New Roman" w:hAnsi="Times New Roman" w:eastAsia="Times New Roman" w:cs="Times New Roman"/>
                 <w:b w:val="0"/>
@@ -1758,12 +1146,8 @@
                 <w:szCs w:val="18"/>
                 <w:u w:val="none"/>
               </w:rPr>
-              <w:t xml:space="preserve">} Interference with utilities or services (for example: breach of covenant of quiet enjoyment) </w:t>
-            </w:r>
-          </w:p>
-          <w:p>
-            <w:pPr>
-              <w:spacing w:before="0" w:beforeAutospacing="off" w:after="0" w:afterAutospacing="off" w:line="360" w:lineRule="auto"/>
+            </w:pPr>
+            <w:r>
               <w:rPr>
                 <w:rFonts w:ascii="Times New Roman" w:hAnsi="Times New Roman" w:eastAsia="Times New Roman" w:cs="Times New Roman"/>
                 <w:b w:val="0"/>
@@ -1777,8 +1161,12 @@
                 <w:szCs w:val="18"/>
                 <w:u w:val="none"/>
               </w:rPr>
-            </w:pPr>
-            <w:r>
+              <w:t xml:space="preserve">{{ output_checkbox(violation_bad_conditions) }} Bad conditions in my home (for example: breach of implied warranty of habitability) </w:t>
+            </w:r>
+          </w:p>
+          <w:p>
+            <w:pPr>
+              <w:spacing w:before="0" w:beforeAutospacing="off" w:after="0" w:afterAutospacing="off" w:line="360" w:lineRule="auto"/>
               <w:rPr>
                 <w:rFonts w:ascii="Times New Roman" w:hAnsi="Times New Roman" w:eastAsia="Times New Roman" w:cs="Times New Roman"/>
                 <w:b w:val="0"/>
@@ -1792,8 +1180,7 @@
                 <w:szCs w:val="18"/>
                 <w:u w:val="none"/>
               </w:rPr>
-              <w:t xml:space="preserve">{{ </w:t>
-            </w:r>
+            </w:pPr>
             <w:r>
               <w:rPr>
                 <w:rFonts w:ascii="Times New Roman" w:hAnsi="Times New Roman" w:eastAsia="Times New Roman" w:cs="Times New Roman"/>
@@ -1808,249 +1195,7 @@
                 <w:szCs w:val="18"/>
                 <w:u w:val="none"/>
               </w:rPr>
-              <w:t>output_checkbox</w:t>
-            </w:r>
-            <w:r>
-              <w:rPr>
-                <w:rFonts w:ascii="Times New Roman" w:hAnsi="Times New Roman" w:eastAsia="Times New Roman" w:cs="Times New Roman"/>
-                <w:b w:val="0"/>
-                <w:bCs w:val="0"/>
-                <w:i w:val="0"/>
-                <w:iCs w:val="0"/>
-                <w:strike w:val="0"/>
-                <w:dstrike w:val="0"/>
-                <w:color w:val="000000" w:themeColor="text1" w:themeTint="FF" w:themeShade="FF"/>
-                <w:sz w:val="18"/>
-                <w:szCs w:val="18"/>
-                <w:u w:val="none"/>
-              </w:rPr>
-              <w:t>(</w:t>
-            </w:r>
-            <w:r>
-              <w:rPr>
-                <w:rFonts w:ascii="Times New Roman" w:hAnsi="Times New Roman" w:eastAsia="Times New Roman" w:cs="Times New Roman"/>
-                <w:b w:val="0"/>
-                <w:bCs w:val="0"/>
-                <w:i w:val="0"/>
-                <w:iCs w:val="0"/>
-                <w:strike w:val="0"/>
-                <w:dstrike w:val="0"/>
-                <w:color w:val="000000" w:themeColor="text1" w:themeTint="FF" w:themeShade="FF"/>
-                <w:sz w:val="18"/>
-                <w:szCs w:val="18"/>
-                <w:u w:val="none"/>
-              </w:rPr>
-              <w:t>violation_bad_conditions</w:t>
-            </w:r>
-            <w:r>
-              <w:rPr>
-                <w:rFonts w:ascii="Times New Roman" w:hAnsi="Times New Roman" w:eastAsia="Times New Roman" w:cs="Times New Roman"/>
-                <w:b w:val="0"/>
-                <w:bCs w:val="0"/>
-                <w:i w:val="0"/>
-                <w:iCs w:val="0"/>
-                <w:strike w:val="0"/>
-                <w:dstrike w:val="0"/>
-                <w:color w:val="000000" w:themeColor="text1" w:themeTint="FF" w:themeShade="FF"/>
-                <w:sz w:val="18"/>
-                <w:szCs w:val="18"/>
-                <w:u w:val="none"/>
-              </w:rPr>
-              <w:t>) }</w:t>
-            </w:r>
-            <w:r>
-              <w:rPr>
-                <w:rFonts w:ascii="Times New Roman" w:hAnsi="Times New Roman" w:eastAsia="Times New Roman" w:cs="Times New Roman"/>
-                <w:b w:val="0"/>
-                <w:bCs w:val="0"/>
-                <w:i w:val="0"/>
-                <w:iCs w:val="0"/>
-                <w:strike w:val="0"/>
-                <w:dstrike w:val="0"/>
-                <w:color w:val="000000" w:themeColor="text1" w:themeTint="FF" w:themeShade="FF"/>
-                <w:sz w:val="18"/>
-                <w:szCs w:val="18"/>
-                <w:u w:val="none"/>
-              </w:rPr>
-              <w:t xml:space="preserve">} Bad conditions in my home (for example: breach of implied warranty of habitability) </w:t>
-            </w:r>
-          </w:p>
-          <w:p>
-            <w:pPr>
-              <w:spacing w:before="0" w:beforeAutospacing="off" w:after="0" w:afterAutospacing="off" w:line="360" w:lineRule="auto"/>
-              <w:rPr>
-                <w:rFonts w:ascii="Times New Roman" w:hAnsi="Times New Roman" w:eastAsia="Times New Roman" w:cs="Times New Roman"/>
-                <w:b w:val="0"/>
-                <w:bCs w:val="0"/>
-                <w:i w:val="0"/>
-                <w:iCs w:val="0"/>
-                <w:strike w:val="0"/>
-                <w:dstrike w:val="0"/>
-                <w:color w:val="000000" w:themeColor="text1" w:themeTint="FF" w:themeShade="FF"/>
-                <w:sz w:val="18"/>
-                <w:szCs w:val="18"/>
-                <w:u w:val="none"/>
-              </w:rPr>
-            </w:pPr>
-            <w:r>
-              <w:rPr>
-                <w:rFonts w:ascii="Times New Roman" w:hAnsi="Times New Roman" w:eastAsia="Times New Roman" w:cs="Times New Roman"/>
-                <w:b w:val="0"/>
-                <w:bCs w:val="0"/>
-                <w:i w:val="0"/>
-                <w:iCs w:val="0"/>
-                <w:strike w:val="0"/>
-                <w:dstrike w:val="0"/>
-                <w:color w:val="000000" w:themeColor="text1" w:themeTint="FF" w:themeShade="FF"/>
-                <w:sz w:val="18"/>
-                <w:szCs w:val="18"/>
-                <w:u w:val="none"/>
-              </w:rPr>
-              <w:t xml:space="preserve">{{ </w:t>
-            </w:r>
-            <w:r>
-              <w:rPr>
-                <w:rFonts w:ascii="Times New Roman" w:hAnsi="Times New Roman" w:eastAsia="Times New Roman" w:cs="Times New Roman"/>
-                <w:b w:val="0"/>
-                <w:bCs w:val="0"/>
-                <w:i w:val="0"/>
-                <w:iCs w:val="0"/>
-                <w:strike w:val="0"/>
-                <w:dstrike w:val="0"/>
-                <w:color w:val="000000" w:themeColor="text1" w:themeTint="FF" w:themeShade="FF"/>
-                <w:sz w:val="18"/>
-                <w:szCs w:val="18"/>
-                <w:u w:val="none"/>
-              </w:rPr>
-              <w:t>output_checkbox</w:t>
-            </w:r>
-            <w:r>
-              <w:rPr>
-                <w:rFonts w:ascii="Times New Roman" w:hAnsi="Times New Roman" w:eastAsia="Times New Roman" w:cs="Times New Roman"/>
-                <w:b w:val="0"/>
-                <w:bCs w:val="0"/>
-                <w:i w:val="0"/>
-                <w:iCs w:val="0"/>
-                <w:strike w:val="0"/>
-                <w:dstrike w:val="0"/>
-                <w:color w:val="000000" w:themeColor="text1" w:themeTint="FF" w:themeShade="FF"/>
-                <w:sz w:val="18"/>
-                <w:szCs w:val="18"/>
-                <w:u w:val="none"/>
-              </w:rPr>
-              <w:t>(</w:t>
-            </w:r>
-            <w:r>
-              <w:rPr>
-                <w:rFonts w:ascii="Times New Roman" w:hAnsi="Times New Roman" w:eastAsia="Times New Roman" w:cs="Times New Roman"/>
-                <w:b w:val="0"/>
-                <w:bCs w:val="0"/>
-                <w:i w:val="0"/>
-                <w:iCs w:val="0"/>
-                <w:strike w:val="0"/>
-                <w:dstrike w:val="0"/>
-                <w:color w:val="000000" w:themeColor="text1" w:themeTint="FF" w:themeShade="FF"/>
-                <w:sz w:val="18"/>
-                <w:szCs w:val="18"/>
-                <w:u w:val="none"/>
-              </w:rPr>
-              <w:t>other_issues</w:t>
-            </w:r>
-            <w:r>
-              <w:rPr>
-                <w:rFonts w:ascii="Times New Roman" w:hAnsi="Times New Roman" w:eastAsia="Times New Roman" w:cs="Times New Roman"/>
-                <w:b w:val="0"/>
-                <w:bCs w:val="0"/>
-                <w:i w:val="0"/>
-                <w:iCs w:val="0"/>
-                <w:strike w:val="0"/>
-                <w:dstrike w:val="0"/>
-                <w:color w:val="000000" w:themeColor="text1" w:themeTint="FF" w:themeShade="FF"/>
-                <w:sz w:val="18"/>
-                <w:szCs w:val="18"/>
-                <w:u w:val="none"/>
-              </w:rPr>
-              <w:t>) }</w:t>
-            </w:r>
-            <w:r>
-              <w:rPr>
-                <w:rFonts w:ascii="Times New Roman" w:hAnsi="Times New Roman" w:eastAsia="Times New Roman" w:cs="Times New Roman"/>
-                <w:b w:val="0"/>
-                <w:bCs w:val="0"/>
-                <w:i w:val="0"/>
-                <w:iCs w:val="0"/>
-                <w:strike w:val="0"/>
-                <w:dstrike w:val="0"/>
-                <w:color w:val="000000" w:themeColor="text1" w:themeTint="FF" w:themeShade="FF"/>
-                <w:sz w:val="18"/>
-                <w:szCs w:val="18"/>
-                <w:u w:val="none"/>
-              </w:rPr>
-              <w:t xml:space="preserve">} Other: {{ </w:t>
-            </w:r>
-            <w:r>
-              <w:rPr>
-                <w:rFonts w:ascii="Times New Roman" w:hAnsi="Times New Roman" w:eastAsia="Times New Roman" w:cs="Times New Roman"/>
-                <w:b w:val="0"/>
-                <w:bCs w:val="0"/>
-                <w:i w:val="0"/>
-                <w:iCs w:val="0"/>
-                <w:strike w:val="0"/>
-                <w:dstrike w:val="0"/>
-                <w:color w:val="000000" w:themeColor="text1" w:themeTint="FF" w:themeShade="FF"/>
-                <w:sz w:val="18"/>
-                <w:szCs w:val="18"/>
-                <w:u w:val="none"/>
-              </w:rPr>
-              <w:t>other_issues</w:t>
-            </w:r>
-            <w:r>
-              <w:rPr>
-                <w:rFonts w:ascii="Times New Roman" w:hAnsi="Times New Roman" w:eastAsia="Times New Roman" w:cs="Times New Roman"/>
-                <w:b w:val="0"/>
-                <w:bCs w:val="0"/>
-                <w:i w:val="0"/>
-                <w:iCs w:val="0"/>
-                <w:strike w:val="0"/>
-                <w:dstrike w:val="0"/>
-                <w:color w:val="000000" w:themeColor="text1" w:themeTint="FF" w:themeShade="FF"/>
-                <w:sz w:val="18"/>
-                <w:szCs w:val="18"/>
-                <w:u w:val="none"/>
-              </w:rPr>
-              <w:t>_type</w:t>
-            </w:r>
-            <w:r>
-              <w:rPr>
-                <w:rFonts w:ascii="Times New Roman" w:hAnsi="Times New Roman" w:eastAsia="Times New Roman" w:cs="Times New Roman"/>
-                <w:b w:val="0"/>
-                <w:bCs w:val="0"/>
-                <w:i w:val="0"/>
-                <w:iCs w:val="0"/>
-                <w:strike w:val="0"/>
-                <w:dstrike w:val="0"/>
-                <w:color w:val="000000" w:themeColor="text1" w:themeTint="FF" w:themeShade="FF"/>
-                <w:sz w:val="18"/>
-                <w:szCs w:val="18"/>
-                <w:u w:val="none"/>
-              </w:rPr>
-              <w:t xml:space="preserve"> }</w:t>
-            </w:r>
-            <w:r>
-              <w:rPr>
-                <w:rFonts w:ascii="Times New Roman" w:hAnsi="Times New Roman" w:eastAsia="Times New Roman" w:cs="Times New Roman"/>
-                <w:b w:val="0"/>
-                <w:bCs w:val="0"/>
-                <w:i w:val="0"/>
-                <w:iCs w:val="0"/>
-                <w:strike w:val="0"/>
-                <w:dstrike w:val="0"/>
-                <w:color w:val="000000" w:themeColor="text1" w:themeTint="FF" w:themeShade="FF"/>
-                <w:sz w:val="18"/>
-                <w:szCs w:val="18"/>
-                <w:u w:val="none"/>
-              </w:rPr>
-              <w:t>}</w:t>
+              <w:t xml:space="preserve">{{ output_checkbox(other_issues) }} Other: {{ other_issues_type }}</w:t>
             </w:r>
           </w:p>
         </w:tc>
@@ -2141,9 +1286,12 @@
                 <w:u w:val="none"/>
                 <w:lang w:val="en-GB"/>
               </w:rPr>
-              <w:t xml:space="preserve">{{ </w:t>
-            </w:r>
-            <w:r>
+              <w:t xml:space="preserve">{{ output_checkbox(stop_eviction) }} Attempting to evict me from my home without an order from the court. (for example: changing the locks)</w:t>
+            </w:r>
+          </w:p>
+          <w:p>
+            <w:pPr>
+              <w:spacing w:before="0" w:beforeAutospacing="off" w:after="0" w:afterAutospacing="off" w:line="360" w:lineRule="auto"/>
               <w:rPr>
                 <w:rFonts w:ascii="Times New Roman" w:hAnsi="Times New Roman" w:eastAsia="Times New Roman" w:cs="Times New Roman"/>
                 <w:b w:val="0"/>
@@ -2159,8 +1307,7 @@
                 <w:u w:val="none"/>
                 <w:lang w:val="en-GB"/>
               </w:rPr>
-              <w:t>output_checkbox</w:t>
-            </w:r>
+            </w:pPr>
             <w:r>
               <w:rPr>
                 <w:rFonts w:ascii="Times New Roman" w:hAnsi="Times New Roman" w:eastAsia="Times New Roman" w:cs="Times New Roman"/>
@@ -2177,13 +1324,13 @@
                 <w:u w:val="none"/>
                 <w:lang w:val="en-GB"/>
               </w:rPr>
-              <w:t>(</w:t>
-            </w:r>
-            <w:r>
-              <w:rPr>
-                <w:rFonts w:ascii="Times New Roman" w:hAnsi="Times New Roman" w:eastAsia="Times New Roman" w:cs="Times New Roman"/>
-                <w:b w:val="0"/>
-                <w:bCs w:val="0"/>
+              <w:t xml:space="preserve">{{ output_checkbox(utilities_needed) }} Failing to provide the following utility or service to my home:</w:t>
+            </w:r>
+            <w:r>
+              <w:rPr>
+                <w:rFonts w:ascii="Times New Roman" w:hAnsi="Times New Roman" w:eastAsia="Times New Roman" w:cs="Times New Roman"/>
+                <w:b w:val="1"/>
+                <w:bCs w:val="1"/>
                 <w:i w:val="0"/>
                 <w:iCs w:val="0"/>
                 <w:strike w:val="0"/>
@@ -2195,7 +1342,7 @@
                 <w:u w:val="none"/>
                 <w:lang w:val="en-GB"/>
               </w:rPr>
-              <w:t>stop_eviction</w:t>
+              <w:t xml:space="preserve"> </w:t>
             </w:r>
             <w:r>
               <w:rPr>
@@ -2213,9 +1360,12 @@
                 <w:u w:val="none"/>
                 <w:lang w:val="en-GB"/>
               </w:rPr>
-              <w:t>) }</w:t>
-            </w:r>
-            <w:r>
+              <w:t xml:space="preserve">{{ utilities_needed_type }}</w:t>
+            </w:r>
+          </w:p>
+          <w:p>
+            <w:pPr>
+              <w:spacing w:before="0" w:beforeAutospacing="off" w:after="0" w:afterAutospacing="off" w:line="360" w:lineRule="auto"/>
               <w:rPr>
                 <w:rFonts w:ascii="Times New Roman" w:hAnsi="Times New Roman" w:eastAsia="Times New Roman" w:cs="Times New Roman"/>
                 <w:b w:val="0"/>
@@ -2231,12 +1381,8 @@
                 <w:u w:val="none"/>
                 <w:lang w:val="en-GB"/>
               </w:rPr>
-              <w:t>} Attempting to evict me from my home without an order from the court. (for example: changing the locks)</w:t>
-            </w:r>
-          </w:p>
-          <w:p>
-            <w:pPr>
-              <w:spacing w:before="0" w:beforeAutospacing="off" w:after="0" w:afterAutospacing="off" w:line="360" w:lineRule="auto"/>
+            </w:pPr>
+            <w:r>
               <w:rPr>
                 <w:rFonts w:ascii="Times New Roman" w:hAnsi="Times New Roman" w:eastAsia="Times New Roman" w:cs="Times New Roman"/>
                 <w:b w:val="0"/>
@@ -2252,8 +1398,12 @@
                 <w:u w:val="none"/>
                 <w:lang w:val="en-GB"/>
               </w:rPr>
-            </w:pPr>
-            <w:r>
+              <w:t xml:space="preserve">{{ output_checkbox(stop_fail_repairs) }} Failing to make all necessary repairs to my home. </w:t>
+            </w:r>
+          </w:p>
+          <w:p>
+            <w:pPr>
+              <w:spacing w:before="0" w:beforeAutospacing="off" w:after="0" w:afterAutospacing="off" w:line="360" w:lineRule="auto"/>
               <w:rPr>
                 <w:rFonts w:ascii="Times New Roman" w:hAnsi="Times New Roman" w:eastAsia="Times New Roman" w:cs="Times New Roman"/>
                 <w:b w:val="0"/>
@@ -2269,8 +1419,7 @@
                 <w:u w:val="none"/>
                 <w:lang w:val="en-GB"/>
               </w:rPr>
-              <w:t xml:space="preserve">{{ </w:t>
-            </w:r>
+            </w:pPr>
             <w:r>
               <w:rPr>
                 <w:rFonts w:ascii="Times New Roman" w:hAnsi="Times New Roman" w:eastAsia="Times New Roman" w:cs="Times New Roman"/>
@@ -2287,9 +1436,12 @@
                 <w:u w:val="none"/>
                 <w:lang w:val="en-GB"/>
               </w:rPr>
-              <w:t>output_checkbox</w:t>
-            </w:r>
-            <w:r>
+              <w:t xml:space="preserve">{{ output_checkbox(stop_return_belongings) }} Refusing to return my personal belongings (listed in Complaint above) </w:t>
+            </w:r>
+          </w:p>
+          <w:p>
+            <w:pPr>
+              <w:spacing w:before="0" w:beforeAutospacing="off" w:after="0" w:afterAutospacing="off" w:line="360" w:lineRule="auto"/>
               <w:rPr>
                 <w:rFonts w:ascii="Times New Roman" w:hAnsi="Times New Roman" w:eastAsia="Times New Roman" w:cs="Times New Roman"/>
                 <w:b w:val="0"/>
@@ -2305,8 +1457,7 @@
                 <w:u w:val="none"/>
                 <w:lang w:val="en-GB"/>
               </w:rPr>
-              <w:t>(</w:t>
-            </w:r>
+            </w:pPr>
             <w:r>
               <w:rPr>
                 <w:rFonts w:ascii="Times New Roman" w:hAnsi="Times New Roman" w:eastAsia="Times New Roman" w:cs="Times New Roman"/>
@@ -2323,607 +1474,7 @@
                 <w:u w:val="none"/>
                 <w:lang w:val="en-GB"/>
               </w:rPr>
-              <w:t>utilities_needed</w:t>
-            </w:r>
-            <w:r>
-              <w:rPr>
-                <w:rFonts w:ascii="Times New Roman" w:hAnsi="Times New Roman" w:eastAsia="Times New Roman" w:cs="Times New Roman"/>
-                <w:b w:val="0"/>
-                <w:bCs w:val="0"/>
-                <w:i w:val="0"/>
-                <w:iCs w:val="0"/>
-                <w:strike w:val="0"/>
-                <w:dstrike w:val="0"/>
-                <w:noProof w:val="0"/>
-                <w:color w:val="000000" w:themeColor="text1" w:themeTint="FF" w:themeShade="FF"/>
-                <w:sz w:val="18"/>
-                <w:szCs w:val="18"/>
-                <w:u w:val="none"/>
-                <w:lang w:val="en-GB"/>
-              </w:rPr>
-              <w:t>) }</w:t>
-            </w:r>
-            <w:r>
-              <w:rPr>
-                <w:rFonts w:ascii="Times New Roman" w:hAnsi="Times New Roman" w:eastAsia="Times New Roman" w:cs="Times New Roman"/>
-                <w:b w:val="0"/>
-                <w:bCs w:val="0"/>
-                <w:i w:val="0"/>
-                <w:iCs w:val="0"/>
-                <w:strike w:val="0"/>
-                <w:dstrike w:val="0"/>
-                <w:noProof w:val="0"/>
-                <w:color w:val="000000" w:themeColor="text1" w:themeTint="FF" w:themeShade="FF"/>
-                <w:sz w:val="18"/>
-                <w:szCs w:val="18"/>
-                <w:u w:val="none"/>
-                <w:lang w:val="en-GB"/>
-              </w:rPr>
-              <w:t>} Failing to provide the following utility or service to my home:</w:t>
-            </w:r>
-            <w:r>
-              <w:rPr>
-                <w:rFonts w:ascii="Times New Roman" w:hAnsi="Times New Roman" w:eastAsia="Times New Roman" w:cs="Times New Roman"/>
-                <w:b w:val="1"/>
-                <w:bCs w:val="1"/>
-                <w:i w:val="0"/>
-                <w:iCs w:val="0"/>
-                <w:strike w:val="0"/>
-                <w:dstrike w:val="0"/>
-                <w:noProof w:val="0"/>
-                <w:color w:val="000000" w:themeColor="text1" w:themeTint="FF" w:themeShade="FF"/>
-                <w:sz w:val="18"/>
-                <w:szCs w:val="18"/>
-                <w:u w:val="none"/>
-                <w:lang w:val="en-GB"/>
-              </w:rPr>
-              <w:t xml:space="preserve"> </w:t>
-            </w:r>
-            <w:r>
-              <w:rPr>
-                <w:rFonts w:ascii="Times New Roman" w:hAnsi="Times New Roman" w:eastAsia="Times New Roman" w:cs="Times New Roman"/>
-                <w:b w:val="0"/>
-                <w:bCs w:val="0"/>
-                <w:i w:val="0"/>
-                <w:iCs w:val="0"/>
-                <w:strike w:val="0"/>
-                <w:dstrike w:val="0"/>
-                <w:noProof w:val="0"/>
-                <w:color w:val="000000" w:themeColor="text1" w:themeTint="FF" w:themeShade="FF"/>
-                <w:sz w:val="18"/>
-                <w:szCs w:val="18"/>
-                <w:u w:val="none"/>
-                <w:lang w:val="en-GB"/>
-              </w:rPr>
-              <w:t xml:space="preserve">{{ </w:t>
-            </w:r>
-            <w:r>
-              <w:rPr>
-                <w:rFonts w:ascii="Times New Roman" w:hAnsi="Times New Roman" w:eastAsia="Times New Roman" w:cs="Times New Roman"/>
-                <w:b w:val="0"/>
-                <w:bCs w:val="0"/>
-                <w:i w:val="0"/>
-                <w:iCs w:val="0"/>
-                <w:strike w:val="0"/>
-                <w:dstrike w:val="0"/>
-                <w:noProof w:val="0"/>
-                <w:color w:val="000000" w:themeColor="text1" w:themeTint="FF" w:themeShade="FF"/>
-                <w:sz w:val="18"/>
-                <w:szCs w:val="18"/>
-                <w:u w:val="none"/>
-                <w:lang w:val="en-GB"/>
-              </w:rPr>
-              <w:t>utilities_needed</w:t>
-            </w:r>
-            <w:r>
-              <w:rPr>
-                <w:rFonts w:ascii="Times New Roman" w:hAnsi="Times New Roman" w:eastAsia="Times New Roman" w:cs="Times New Roman"/>
-                <w:b w:val="0"/>
-                <w:bCs w:val="0"/>
-                <w:i w:val="0"/>
-                <w:iCs w:val="0"/>
-                <w:strike w:val="0"/>
-                <w:dstrike w:val="0"/>
-                <w:noProof w:val="0"/>
-                <w:color w:val="000000" w:themeColor="text1" w:themeTint="FF" w:themeShade="FF"/>
-                <w:sz w:val="18"/>
-                <w:szCs w:val="18"/>
-                <w:u w:val="none"/>
-                <w:lang w:val="en-GB"/>
-              </w:rPr>
-              <w:t>_type</w:t>
-            </w:r>
-            <w:r>
-              <w:rPr>
-                <w:rFonts w:ascii="Times New Roman" w:hAnsi="Times New Roman" w:eastAsia="Times New Roman" w:cs="Times New Roman"/>
-                <w:b w:val="0"/>
-                <w:bCs w:val="0"/>
-                <w:i w:val="0"/>
-                <w:iCs w:val="0"/>
-                <w:strike w:val="0"/>
-                <w:dstrike w:val="0"/>
-                <w:noProof w:val="0"/>
-                <w:color w:val="000000" w:themeColor="text1" w:themeTint="FF" w:themeShade="FF"/>
-                <w:sz w:val="18"/>
-                <w:szCs w:val="18"/>
-                <w:u w:val="none"/>
-                <w:lang w:val="en-GB"/>
-              </w:rPr>
-              <w:t xml:space="preserve"> }</w:t>
-            </w:r>
-            <w:r>
-              <w:rPr>
-                <w:rFonts w:ascii="Times New Roman" w:hAnsi="Times New Roman" w:eastAsia="Times New Roman" w:cs="Times New Roman"/>
-                <w:b w:val="0"/>
-                <w:bCs w:val="0"/>
-                <w:i w:val="0"/>
-                <w:iCs w:val="0"/>
-                <w:strike w:val="0"/>
-                <w:dstrike w:val="0"/>
-                <w:noProof w:val="0"/>
-                <w:color w:val="000000" w:themeColor="text1" w:themeTint="FF" w:themeShade="FF"/>
-                <w:sz w:val="18"/>
-                <w:szCs w:val="18"/>
-                <w:u w:val="none"/>
-                <w:lang w:val="en-GB"/>
-              </w:rPr>
-              <w:t>}</w:t>
-            </w:r>
-          </w:p>
-          <w:p>
-            <w:pPr>
-              <w:spacing w:before="0" w:beforeAutospacing="off" w:after="0" w:afterAutospacing="off" w:line="360" w:lineRule="auto"/>
-              <w:rPr>
-                <w:rFonts w:ascii="Times New Roman" w:hAnsi="Times New Roman" w:eastAsia="Times New Roman" w:cs="Times New Roman"/>
-                <w:b w:val="0"/>
-                <w:bCs w:val="0"/>
-                <w:i w:val="0"/>
-                <w:iCs w:val="0"/>
-                <w:strike w:val="0"/>
-                <w:dstrike w:val="0"/>
-                <w:noProof w:val="0"/>
-                <w:color w:val="000000" w:themeColor="text1" w:themeTint="FF" w:themeShade="FF"/>
-                <w:sz w:val="18"/>
-                <w:szCs w:val="18"/>
-                <w:u w:val="none"/>
-                <w:lang w:val="en-GB"/>
-              </w:rPr>
-            </w:pPr>
-            <w:r>
-              <w:rPr>
-                <w:rFonts w:ascii="Times New Roman" w:hAnsi="Times New Roman" w:eastAsia="Times New Roman" w:cs="Times New Roman"/>
-                <w:b w:val="0"/>
-                <w:bCs w:val="0"/>
-                <w:i w:val="0"/>
-                <w:iCs w:val="0"/>
-                <w:strike w:val="0"/>
-                <w:dstrike w:val="0"/>
-                <w:noProof w:val="0"/>
-                <w:color w:val="000000" w:themeColor="text1" w:themeTint="FF" w:themeShade="FF"/>
-                <w:sz w:val="18"/>
-                <w:szCs w:val="18"/>
-                <w:u w:val="none"/>
-                <w:lang w:val="en-GB"/>
-              </w:rPr>
-              <w:t xml:space="preserve">{{ </w:t>
-            </w:r>
-            <w:r>
-              <w:rPr>
-                <w:rFonts w:ascii="Times New Roman" w:hAnsi="Times New Roman" w:eastAsia="Times New Roman" w:cs="Times New Roman"/>
-                <w:b w:val="0"/>
-                <w:bCs w:val="0"/>
-                <w:i w:val="0"/>
-                <w:iCs w:val="0"/>
-                <w:strike w:val="0"/>
-                <w:dstrike w:val="0"/>
-                <w:noProof w:val="0"/>
-                <w:color w:val="000000" w:themeColor="text1" w:themeTint="FF" w:themeShade="FF"/>
-                <w:sz w:val="18"/>
-                <w:szCs w:val="18"/>
-                <w:u w:val="none"/>
-                <w:lang w:val="en-GB"/>
-              </w:rPr>
-              <w:t>output_checkbox</w:t>
-            </w:r>
-            <w:r>
-              <w:rPr>
-                <w:rFonts w:ascii="Times New Roman" w:hAnsi="Times New Roman" w:eastAsia="Times New Roman" w:cs="Times New Roman"/>
-                <w:b w:val="0"/>
-                <w:bCs w:val="0"/>
-                <w:i w:val="0"/>
-                <w:iCs w:val="0"/>
-                <w:strike w:val="0"/>
-                <w:dstrike w:val="0"/>
-                <w:noProof w:val="0"/>
-                <w:color w:val="000000" w:themeColor="text1" w:themeTint="FF" w:themeShade="FF"/>
-                <w:sz w:val="18"/>
-                <w:szCs w:val="18"/>
-                <w:u w:val="none"/>
-                <w:lang w:val="en-GB"/>
-              </w:rPr>
-              <w:t>(</w:t>
-            </w:r>
-            <w:r>
-              <w:rPr>
-                <w:rFonts w:ascii="Times New Roman" w:hAnsi="Times New Roman" w:eastAsia="Times New Roman" w:cs="Times New Roman"/>
-                <w:b w:val="0"/>
-                <w:bCs w:val="0"/>
-                <w:i w:val="0"/>
-                <w:iCs w:val="0"/>
-                <w:strike w:val="0"/>
-                <w:dstrike w:val="0"/>
-                <w:noProof w:val="0"/>
-                <w:color w:val="000000" w:themeColor="text1" w:themeTint="FF" w:themeShade="FF"/>
-                <w:sz w:val="18"/>
-                <w:szCs w:val="18"/>
-                <w:u w:val="none"/>
-                <w:lang w:val="en-GB"/>
-              </w:rPr>
-              <w:t>stop_fail_repairs</w:t>
-            </w:r>
-            <w:r>
-              <w:rPr>
-                <w:rFonts w:ascii="Times New Roman" w:hAnsi="Times New Roman" w:eastAsia="Times New Roman" w:cs="Times New Roman"/>
-                <w:b w:val="0"/>
-                <w:bCs w:val="0"/>
-                <w:i w:val="0"/>
-                <w:iCs w:val="0"/>
-                <w:strike w:val="0"/>
-                <w:dstrike w:val="0"/>
-                <w:noProof w:val="0"/>
-                <w:color w:val="000000" w:themeColor="text1" w:themeTint="FF" w:themeShade="FF"/>
-                <w:sz w:val="18"/>
-                <w:szCs w:val="18"/>
-                <w:u w:val="none"/>
-                <w:lang w:val="en-GB"/>
-              </w:rPr>
-              <w:t>) }</w:t>
-            </w:r>
-            <w:r>
-              <w:rPr>
-                <w:rFonts w:ascii="Times New Roman" w:hAnsi="Times New Roman" w:eastAsia="Times New Roman" w:cs="Times New Roman"/>
-                <w:b w:val="0"/>
-                <w:bCs w:val="0"/>
-                <w:i w:val="0"/>
-                <w:iCs w:val="0"/>
-                <w:strike w:val="0"/>
-                <w:dstrike w:val="0"/>
-                <w:noProof w:val="0"/>
-                <w:color w:val="000000" w:themeColor="text1" w:themeTint="FF" w:themeShade="FF"/>
-                <w:sz w:val="18"/>
-                <w:szCs w:val="18"/>
-                <w:u w:val="none"/>
-                <w:lang w:val="en-GB"/>
-              </w:rPr>
-              <w:t xml:space="preserve">} Failing to make all necessary repairs to my home. </w:t>
-            </w:r>
-          </w:p>
-          <w:p>
-            <w:pPr>
-              <w:spacing w:before="0" w:beforeAutospacing="off" w:after="0" w:afterAutospacing="off" w:line="360" w:lineRule="auto"/>
-              <w:rPr>
-                <w:rFonts w:ascii="Times New Roman" w:hAnsi="Times New Roman" w:eastAsia="Times New Roman" w:cs="Times New Roman"/>
-                <w:b w:val="0"/>
-                <w:bCs w:val="0"/>
-                <w:i w:val="0"/>
-                <w:iCs w:val="0"/>
-                <w:strike w:val="0"/>
-                <w:dstrike w:val="0"/>
-                <w:noProof w:val="0"/>
-                <w:color w:val="000000" w:themeColor="text1" w:themeTint="FF" w:themeShade="FF"/>
-                <w:sz w:val="18"/>
-                <w:szCs w:val="18"/>
-                <w:u w:val="none"/>
-                <w:lang w:val="en-GB"/>
-              </w:rPr>
-            </w:pPr>
-            <w:r>
-              <w:rPr>
-                <w:rFonts w:ascii="Times New Roman" w:hAnsi="Times New Roman" w:eastAsia="Times New Roman" w:cs="Times New Roman"/>
-                <w:b w:val="0"/>
-                <w:bCs w:val="0"/>
-                <w:i w:val="0"/>
-                <w:iCs w:val="0"/>
-                <w:strike w:val="0"/>
-                <w:dstrike w:val="0"/>
-                <w:noProof w:val="0"/>
-                <w:color w:val="000000" w:themeColor="text1" w:themeTint="FF" w:themeShade="FF"/>
-                <w:sz w:val="18"/>
-                <w:szCs w:val="18"/>
-                <w:u w:val="none"/>
-                <w:lang w:val="en-GB"/>
-              </w:rPr>
-              <w:t xml:space="preserve">{{ </w:t>
-            </w:r>
-            <w:r>
-              <w:rPr>
-                <w:rFonts w:ascii="Times New Roman" w:hAnsi="Times New Roman" w:eastAsia="Times New Roman" w:cs="Times New Roman"/>
-                <w:b w:val="0"/>
-                <w:bCs w:val="0"/>
-                <w:i w:val="0"/>
-                <w:iCs w:val="0"/>
-                <w:strike w:val="0"/>
-                <w:dstrike w:val="0"/>
-                <w:noProof w:val="0"/>
-                <w:color w:val="000000" w:themeColor="text1" w:themeTint="FF" w:themeShade="FF"/>
-                <w:sz w:val="18"/>
-                <w:szCs w:val="18"/>
-                <w:u w:val="none"/>
-                <w:lang w:val="en-GB"/>
-              </w:rPr>
-              <w:t>output_checkbox</w:t>
-            </w:r>
-            <w:r>
-              <w:rPr>
-                <w:rFonts w:ascii="Times New Roman" w:hAnsi="Times New Roman" w:eastAsia="Times New Roman" w:cs="Times New Roman"/>
-                <w:b w:val="0"/>
-                <w:bCs w:val="0"/>
-                <w:i w:val="0"/>
-                <w:iCs w:val="0"/>
-                <w:strike w:val="0"/>
-                <w:dstrike w:val="0"/>
-                <w:noProof w:val="0"/>
-                <w:color w:val="000000" w:themeColor="text1" w:themeTint="FF" w:themeShade="FF"/>
-                <w:sz w:val="18"/>
-                <w:szCs w:val="18"/>
-                <w:u w:val="none"/>
-                <w:lang w:val="en-GB"/>
-              </w:rPr>
-              <w:t>(</w:t>
-            </w:r>
-            <w:r>
-              <w:rPr>
-                <w:rFonts w:ascii="Times New Roman" w:hAnsi="Times New Roman" w:eastAsia="Times New Roman" w:cs="Times New Roman"/>
-                <w:b w:val="0"/>
-                <w:bCs w:val="0"/>
-                <w:i w:val="0"/>
-                <w:iCs w:val="0"/>
-                <w:strike w:val="0"/>
-                <w:dstrike w:val="0"/>
-                <w:noProof w:val="0"/>
-                <w:color w:val="000000" w:themeColor="text1" w:themeTint="FF" w:themeShade="FF"/>
-                <w:sz w:val="18"/>
-                <w:szCs w:val="18"/>
-                <w:u w:val="none"/>
-                <w:lang w:val="en-GB"/>
-              </w:rPr>
-              <w:t>stop_return_belongings</w:t>
-            </w:r>
-            <w:r>
-              <w:rPr>
-                <w:rFonts w:ascii="Times New Roman" w:hAnsi="Times New Roman" w:eastAsia="Times New Roman" w:cs="Times New Roman"/>
-                <w:b w:val="0"/>
-                <w:bCs w:val="0"/>
-                <w:i w:val="0"/>
-                <w:iCs w:val="0"/>
-                <w:strike w:val="0"/>
-                <w:dstrike w:val="0"/>
-                <w:noProof w:val="0"/>
-                <w:color w:val="000000" w:themeColor="text1" w:themeTint="FF" w:themeShade="FF"/>
-                <w:sz w:val="18"/>
-                <w:szCs w:val="18"/>
-                <w:u w:val="none"/>
-                <w:lang w:val="en-GB"/>
-              </w:rPr>
-              <w:t>) }</w:t>
-            </w:r>
-            <w:r>
-              <w:rPr>
-                <w:rFonts w:ascii="Times New Roman" w:hAnsi="Times New Roman" w:eastAsia="Times New Roman" w:cs="Times New Roman"/>
-                <w:b w:val="0"/>
-                <w:bCs w:val="0"/>
-                <w:i w:val="0"/>
-                <w:iCs w:val="0"/>
-                <w:strike w:val="0"/>
-                <w:dstrike w:val="0"/>
-                <w:noProof w:val="0"/>
-                <w:color w:val="000000" w:themeColor="text1" w:themeTint="FF" w:themeShade="FF"/>
-                <w:sz w:val="18"/>
-                <w:szCs w:val="18"/>
-                <w:u w:val="none"/>
-                <w:lang w:val="en-GB"/>
-              </w:rPr>
-              <w:t xml:space="preserve">} Refusing to return my personal belongings (listed in Complaint above) </w:t>
-            </w:r>
-          </w:p>
-          <w:p>
-            <w:pPr>
-              <w:spacing w:before="0" w:beforeAutospacing="off" w:after="0" w:afterAutospacing="off" w:line="360" w:lineRule="auto"/>
-              <w:rPr>
-                <w:rFonts w:ascii="Times New Roman" w:hAnsi="Times New Roman" w:eastAsia="Times New Roman" w:cs="Times New Roman"/>
-                <w:b w:val="0"/>
-                <w:bCs w:val="0"/>
-                <w:i w:val="0"/>
-                <w:iCs w:val="0"/>
-                <w:strike w:val="0"/>
-                <w:dstrike w:val="0"/>
-                <w:noProof w:val="0"/>
-                <w:color w:val="000000" w:themeColor="text1" w:themeTint="FF" w:themeShade="FF"/>
-                <w:sz w:val="18"/>
-                <w:szCs w:val="18"/>
-                <w:u w:val="none"/>
-                <w:lang w:val="en-GB"/>
-              </w:rPr>
-            </w:pPr>
-            <w:r>
-              <w:rPr>
-                <w:rFonts w:ascii="Times New Roman" w:hAnsi="Times New Roman" w:eastAsia="Times New Roman" w:cs="Times New Roman"/>
-                <w:b w:val="0"/>
-                <w:bCs w:val="0"/>
-                <w:i w:val="0"/>
-                <w:iCs w:val="0"/>
-                <w:strike w:val="0"/>
-                <w:dstrike w:val="0"/>
-                <w:noProof w:val="0"/>
-                <w:color w:val="000000" w:themeColor="text1" w:themeTint="FF" w:themeShade="FF"/>
-                <w:sz w:val="18"/>
-                <w:szCs w:val="18"/>
-                <w:u w:val="none"/>
-                <w:lang w:val="en-GB"/>
-              </w:rPr>
-              <w:t xml:space="preserve">{{ </w:t>
-            </w:r>
-            <w:r>
-              <w:rPr>
-                <w:rFonts w:ascii="Times New Roman" w:hAnsi="Times New Roman" w:eastAsia="Times New Roman" w:cs="Times New Roman"/>
-                <w:b w:val="0"/>
-                <w:bCs w:val="0"/>
-                <w:i w:val="0"/>
-                <w:iCs w:val="0"/>
-                <w:strike w:val="0"/>
-                <w:dstrike w:val="0"/>
-                <w:noProof w:val="0"/>
-                <w:color w:val="000000" w:themeColor="text1" w:themeTint="FF" w:themeShade="FF"/>
-                <w:sz w:val="18"/>
-                <w:szCs w:val="18"/>
-                <w:u w:val="none"/>
-                <w:lang w:val="en-GB"/>
-              </w:rPr>
-              <w:t>output_checkbox</w:t>
-            </w:r>
-            <w:r>
-              <w:rPr>
-                <w:rFonts w:ascii="Times New Roman" w:hAnsi="Times New Roman" w:eastAsia="Times New Roman" w:cs="Times New Roman"/>
-                <w:b w:val="0"/>
-                <w:bCs w:val="0"/>
-                <w:i w:val="0"/>
-                <w:iCs w:val="0"/>
-                <w:strike w:val="0"/>
-                <w:dstrike w:val="0"/>
-                <w:noProof w:val="0"/>
-                <w:color w:val="000000" w:themeColor="text1" w:themeTint="FF" w:themeShade="FF"/>
-                <w:sz w:val="18"/>
-                <w:szCs w:val="18"/>
-                <w:u w:val="none"/>
-                <w:lang w:val="en-GB"/>
-              </w:rPr>
-              <w:t>(</w:t>
-            </w:r>
-            <w:r>
-              <w:rPr>
-                <w:rFonts w:ascii="Times New Roman" w:hAnsi="Times New Roman" w:eastAsia="Times New Roman" w:cs="Times New Roman"/>
-                <w:b w:val="0"/>
-                <w:bCs w:val="0"/>
-                <w:i w:val="0"/>
-                <w:iCs w:val="0"/>
-                <w:strike w:val="0"/>
-                <w:dstrike w:val="0"/>
-                <w:noProof w:val="0"/>
-                <w:color w:val="000000" w:themeColor="text1" w:themeTint="FF" w:themeShade="FF"/>
-                <w:sz w:val="18"/>
-                <w:szCs w:val="18"/>
-                <w:u w:val="none"/>
-                <w:lang w:val="en-GB"/>
-              </w:rPr>
-              <w:t>other_court_request</w:t>
-            </w:r>
-            <w:r>
-              <w:rPr>
-                <w:rFonts w:ascii="Times New Roman" w:hAnsi="Times New Roman" w:eastAsia="Times New Roman" w:cs="Times New Roman"/>
-                <w:b w:val="0"/>
-                <w:bCs w:val="0"/>
-                <w:i w:val="0"/>
-                <w:iCs w:val="0"/>
-                <w:strike w:val="0"/>
-                <w:dstrike w:val="0"/>
-                <w:noProof w:val="0"/>
-                <w:color w:val="000000" w:themeColor="text1" w:themeTint="FF" w:themeShade="FF"/>
-                <w:sz w:val="18"/>
-                <w:szCs w:val="18"/>
-                <w:u w:val="none"/>
-                <w:lang w:val="en-GB"/>
-              </w:rPr>
-              <w:t>) }</w:t>
-            </w:r>
-            <w:r>
-              <w:rPr>
-                <w:rFonts w:ascii="Times New Roman" w:hAnsi="Times New Roman" w:eastAsia="Times New Roman" w:cs="Times New Roman"/>
-                <w:b w:val="0"/>
-                <w:bCs w:val="0"/>
-                <w:i w:val="0"/>
-                <w:iCs w:val="0"/>
-                <w:strike w:val="0"/>
-                <w:dstrike w:val="0"/>
-                <w:noProof w:val="0"/>
-                <w:color w:val="000000" w:themeColor="text1" w:themeTint="FF" w:themeShade="FF"/>
-                <w:sz w:val="18"/>
-                <w:szCs w:val="18"/>
-                <w:u w:val="none"/>
-                <w:lang w:val="en-GB"/>
-              </w:rPr>
-              <w:t xml:space="preserve">} Other: {{ </w:t>
-            </w:r>
-            <w:r>
-              <w:rPr>
-                <w:rFonts w:ascii="Times New Roman" w:hAnsi="Times New Roman" w:eastAsia="Times New Roman" w:cs="Times New Roman"/>
-                <w:b w:val="0"/>
-                <w:bCs w:val="0"/>
-                <w:i w:val="0"/>
-                <w:iCs w:val="0"/>
-                <w:strike w:val="0"/>
-                <w:dstrike w:val="0"/>
-                <w:noProof w:val="0"/>
-                <w:color w:val="000000" w:themeColor="text1" w:themeTint="FF" w:themeShade="FF"/>
-                <w:sz w:val="18"/>
-                <w:szCs w:val="18"/>
-                <w:u w:val="none"/>
-                <w:lang w:val="en-GB"/>
-              </w:rPr>
-              <w:t>other_court_request</w:t>
-            </w:r>
-            <w:r>
-              <w:rPr>
-                <w:rFonts w:ascii="Times New Roman" w:hAnsi="Times New Roman" w:eastAsia="Times New Roman" w:cs="Times New Roman"/>
-                <w:b w:val="0"/>
-                <w:bCs w:val="0"/>
-                <w:i w:val="0"/>
-                <w:iCs w:val="0"/>
-                <w:strike w:val="0"/>
-                <w:dstrike w:val="0"/>
-                <w:noProof w:val="0"/>
-                <w:color w:val="000000" w:themeColor="text1" w:themeTint="FF" w:themeShade="FF"/>
-                <w:sz w:val="18"/>
-                <w:szCs w:val="18"/>
-                <w:u w:val="none"/>
-                <w:lang w:val="en-GB"/>
-              </w:rPr>
-              <w:t>_type</w:t>
-            </w:r>
-            <w:r>
-              <w:rPr>
-                <w:rFonts w:ascii="Times New Roman" w:hAnsi="Times New Roman" w:eastAsia="Times New Roman" w:cs="Times New Roman"/>
-                <w:b w:val="0"/>
-                <w:bCs w:val="0"/>
-                <w:i w:val="0"/>
-                <w:iCs w:val="0"/>
-                <w:strike w:val="0"/>
-                <w:dstrike w:val="0"/>
-                <w:noProof w:val="0"/>
-                <w:color w:val="000000" w:themeColor="text1" w:themeTint="FF" w:themeShade="FF"/>
-                <w:sz w:val="18"/>
-                <w:szCs w:val="18"/>
-                <w:u w:val="none"/>
-                <w:lang w:val="en-GB"/>
-              </w:rPr>
-              <w:t xml:space="preserve"> }</w:t>
-            </w:r>
-            <w:r>
-              <w:rPr>
-                <w:rFonts w:ascii="Times New Roman" w:hAnsi="Times New Roman" w:eastAsia="Times New Roman" w:cs="Times New Roman"/>
-                <w:b w:val="0"/>
-                <w:bCs w:val="0"/>
-                <w:i w:val="0"/>
-                <w:iCs w:val="0"/>
-                <w:strike w:val="0"/>
-                <w:dstrike w:val="0"/>
-                <w:noProof w:val="0"/>
-                <w:color w:val="000000" w:themeColor="text1" w:themeTint="FF" w:themeShade="FF"/>
-                <w:sz w:val="18"/>
-                <w:szCs w:val="18"/>
-                <w:u w:val="none"/>
-                <w:lang w:val="en-GB"/>
-              </w:rPr>
-              <w:t>}</w:t>
+              <w:t xml:space="preserve">{{ output_checkbox(other_court_request) }} Other: {{ other_court_request_type }}</w:t>
             </w:r>
           </w:p>
         </w:tc>
@@ -3012,9 +1563,14 @@
                 <w:szCs w:val="18"/>
                 <w:lang w:val="en-GB"/>
               </w:rPr>
-              <w:t xml:space="preserve">{{ </w:t>
-            </w:r>
-            <w:r>
+              <w:t xml:space="preserve">{{ output_checkbox(issue_tro) }} Issue a Temporary Restraining Order (valid for 10 days only; may be requested without immediate notice to the other side)</w:t>
+            </w:r>
+          </w:p>
+          <w:p>
+            <w:pPr>
+              <w:pStyle w:val="Normal"/>
+              <w:shd w:val="clear" w:color="auto" w:fill="FFFFFF" w:themeFill="background1"/>
+              <w:spacing w:before="0" w:beforeAutospacing="off" w:after="0" w:afterAutospacing="off" w:line="360" w:lineRule="auto"/>
               <w:rPr>
                 <w:rFonts w:ascii="Times New Roman" w:hAnsi="Times New Roman" w:eastAsia="Times New Roman" w:cs="Times New Roman"/>
                 <w:b w:val="0"/>
@@ -3029,8 +1585,7 @@
                 <w:szCs w:val="18"/>
                 <w:lang w:val="en-GB"/>
               </w:rPr>
-              <w:t>output_checkbox</w:t>
-            </w:r>
+            </w:pPr>
             <w:r>
               <w:rPr>
                 <w:rFonts w:ascii="Times New Roman" w:hAnsi="Times New Roman" w:eastAsia="Times New Roman" w:cs="Times New Roman"/>
@@ -3046,9 +1601,14 @@
                 <w:szCs w:val="18"/>
                 <w:lang w:val="en-GB"/>
               </w:rPr>
-              <w:t>(</w:t>
-            </w:r>
-            <w:r>
+              <w:t xml:space="preserve">{{ output_checkbox(request_pi) }} Request a Preliminary Injunction (may be issued for longer than 10 days; notice to the other side is required)</w:t>
+            </w:r>
+          </w:p>
+          <w:p>
+            <w:pPr>
+              <w:pStyle w:val="Normal"/>
+              <w:shd w:val="clear" w:color="auto" w:fill="FFFFFF" w:themeFill="background1"/>
+              <w:spacing w:before="0" w:beforeAutospacing="off" w:after="0" w:afterAutospacing="off" w:line="360" w:lineRule="auto"/>
               <w:rPr>
                 <w:rFonts w:ascii="Times New Roman" w:hAnsi="Times New Roman" w:eastAsia="Times New Roman" w:cs="Times New Roman"/>
                 <w:b w:val="0"/>
@@ -3063,8 +1623,7 @@
                 <w:szCs w:val="18"/>
                 <w:lang w:val="en-GB"/>
               </w:rPr>
-              <w:t>issue_tro</w:t>
-            </w:r>
+            </w:pPr>
             <w:r>
               <w:rPr>
                 <w:rFonts w:ascii="Times New Roman" w:hAnsi="Times New Roman" w:eastAsia="Times New Roman" w:cs="Times New Roman"/>
@@ -3080,321 +1639,7 @@
                 <w:szCs w:val="18"/>
                 <w:lang w:val="en-GB"/>
               </w:rPr>
-              <w:t xml:space="preserve">) </w:t>
-            </w:r>
-            <w:r>
-              <w:rPr>
-                <w:rFonts w:ascii="Times New Roman" w:hAnsi="Times New Roman" w:eastAsia="Times New Roman" w:cs="Times New Roman"/>
-                <w:b w:val="0"/>
-                <w:bCs w:val="0"/>
-                <w:i w:val="0"/>
-                <w:iCs w:val="0"/>
-                <w:caps w:val="0"/>
-                <w:smallCaps w:val="0"/>
-                <w:noProof w:val="0"/>
-                <w:color w:val="000000" w:themeColor="text1" w:themeTint="FF" w:themeShade="FF"/>
-                <w:sz w:val="18"/>
-                <w:szCs w:val="18"/>
-                <w:lang w:val="en-GB"/>
-              </w:rPr>
-              <w:t xml:space="preserve">}} </w:t>
-            </w:r>
-            <w:r>
-              <w:rPr>
-                <w:rFonts w:ascii="Times New Roman" w:hAnsi="Times New Roman" w:eastAsia="Times New Roman" w:cs="Times New Roman"/>
-                <w:b w:val="0"/>
-                <w:bCs w:val="0"/>
-                <w:i w:val="0"/>
-                <w:iCs w:val="0"/>
-                <w:caps w:val="0"/>
-                <w:smallCaps w:val="0"/>
-                <w:noProof w:val="0"/>
-                <w:color w:val="000000" w:themeColor="text1" w:themeTint="FF" w:themeShade="FF"/>
-                <w:sz w:val="18"/>
-                <w:szCs w:val="18"/>
-                <w:lang w:val="en-GB"/>
-              </w:rPr>
-              <w:t>Issue a Temporary Restraining Order (valid for 10 days only; may be requested without immediate notice to the other side)</w:t>
-            </w:r>
-          </w:p>
-          <w:p>
-            <w:pPr>
-              <w:pStyle w:val="Normal"/>
-              <w:shd w:val="clear" w:color="auto" w:fill="FFFFFF" w:themeFill="background1"/>
-              <w:spacing w:before="0" w:beforeAutospacing="off" w:after="0" w:afterAutospacing="off" w:line="360" w:lineRule="auto"/>
-              <w:rPr>
-                <w:rFonts w:ascii="Times New Roman" w:hAnsi="Times New Roman" w:eastAsia="Times New Roman" w:cs="Times New Roman"/>
-                <w:b w:val="0"/>
-                <w:bCs w:val="0"/>
-                <w:i w:val="0"/>
-                <w:iCs w:val="0"/>
-                <w:caps w:val="0"/>
-                <w:smallCaps w:val="0"/>
-                <w:noProof w:val="0"/>
-                <w:color w:val="000000" w:themeColor="text1" w:themeTint="FF" w:themeShade="FF"/>
-                <w:sz w:val="18"/>
-                <w:szCs w:val="18"/>
-                <w:lang w:val="en-GB"/>
-              </w:rPr>
-            </w:pPr>
-            <w:r>
-              <w:rPr>
-                <w:rFonts w:ascii="Times New Roman" w:hAnsi="Times New Roman" w:eastAsia="Times New Roman" w:cs="Times New Roman"/>
-                <w:b w:val="0"/>
-                <w:bCs w:val="0"/>
-                <w:i w:val="0"/>
-                <w:iCs w:val="0"/>
-                <w:caps w:val="0"/>
-                <w:smallCaps w:val="0"/>
-                <w:noProof w:val="0"/>
-                <w:color w:val="000000" w:themeColor="text1" w:themeTint="FF" w:themeShade="FF"/>
-                <w:sz w:val="18"/>
-                <w:szCs w:val="18"/>
-                <w:lang w:val="en-GB"/>
-              </w:rPr>
-              <w:t xml:space="preserve">{{ </w:t>
-            </w:r>
-            <w:r>
-              <w:rPr>
-                <w:rFonts w:ascii="Times New Roman" w:hAnsi="Times New Roman" w:eastAsia="Times New Roman" w:cs="Times New Roman"/>
-                <w:b w:val="0"/>
-                <w:bCs w:val="0"/>
-                <w:i w:val="0"/>
-                <w:iCs w:val="0"/>
-                <w:caps w:val="0"/>
-                <w:smallCaps w:val="0"/>
-                <w:noProof w:val="0"/>
-                <w:color w:val="000000" w:themeColor="text1" w:themeTint="FF" w:themeShade="FF"/>
-                <w:sz w:val="18"/>
-                <w:szCs w:val="18"/>
-                <w:lang w:val="en-GB"/>
-              </w:rPr>
-              <w:t>output_checkbox</w:t>
-            </w:r>
-            <w:r>
-              <w:rPr>
-                <w:rFonts w:ascii="Times New Roman" w:hAnsi="Times New Roman" w:eastAsia="Times New Roman" w:cs="Times New Roman"/>
-                <w:b w:val="0"/>
-                <w:bCs w:val="0"/>
-                <w:i w:val="0"/>
-                <w:iCs w:val="0"/>
-                <w:caps w:val="0"/>
-                <w:smallCaps w:val="0"/>
-                <w:noProof w:val="0"/>
-                <w:color w:val="000000" w:themeColor="text1" w:themeTint="FF" w:themeShade="FF"/>
-                <w:sz w:val="18"/>
-                <w:szCs w:val="18"/>
-                <w:lang w:val="en-GB"/>
-              </w:rPr>
-              <w:t>(</w:t>
-            </w:r>
-            <w:r>
-              <w:rPr>
-                <w:rFonts w:ascii="Times New Roman" w:hAnsi="Times New Roman" w:eastAsia="Times New Roman" w:cs="Times New Roman"/>
-                <w:b w:val="0"/>
-                <w:bCs w:val="0"/>
-                <w:i w:val="0"/>
-                <w:iCs w:val="0"/>
-                <w:caps w:val="0"/>
-                <w:smallCaps w:val="0"/>
-                <w:noProof w:val="0"/>
-                <w:color w:val="000000" w:themeColor="text1" w:themeTint="FF" w:themeShade="FF"/>
-                <w:sz w:val="18"/>
-                <w:szCs w:val="18"/>
-                <w:lang w:val="en-GB"/>
-              </w:rPr>
-              <w:t>request_pi</w:t>
-            </w:r>
-            <w:r>
-              <w:rPr>
-                <w:rFonts w:ascii="Times New Roman" w:hAnsi="Times New Roman" w:eastAsia="Times New Roman" w:cs="Times New Roman"/>
-                <w:b w:val="0"/>
-                <w:bCs w:val="0"/>
-                <w:i w:val="0"/>
-                <w:iCs w:val="0"/>
-                <w:caps w:val="0"/>
-                <w:smallCaps w:val="0"/>
-                <w:noProof w:val="0"/>
-                <w:color w:val="000000" w:themeColor="text1" w:themeTint="FF" w:themeShade="FF"/>
-                <w:sz w:val="18"/>
-                <w:szCs w:val="18"/>
-                <w:lang w:val="en-GB"/>
-              </w:rPr>
-              <w:t xml:space="preserve">) }} </w:t>
-            </w:r>
-            <w:r>
-              <w:rPr>
-                <w:rFonts w:ascii="Times New Roman" w:hAnsi="Times New Roman" w:eastAsia="Times New Roman" w:cs="Times New Roman"/>
-                <w:b w:val="0"/>
-                <w:bCs w:val="0"/>
-                <w:i w:val="0"/>
-                <w:iCs w:val="0"/>
-                <w:caps w:val="0"/>
-                <w:smallCaps w:val="0"/>
-                <w:noProof w:val="0"/>
-                <w:color w:val="000000" w:themeColor="text1" w:themeTint="FF" w:themeShade="FF"/>
-                <w:sz w:val="18"/>
-                <w:szCs w:val="18"/>
-                <w:lang w:val="en-GB"/>
-              </w:rPr>
-              <w:t xml:space="preserve">Request a Preliminary Injunction (may be issued for longer than 10 days; notice to the other side is </w:t>
-            </w:r>
-            <w:r>
-              <w:rPr>
-                <w:rFonts w:ascii="Times New Roman" w:hAnsi="Times New Roman" w:eastAsia="Times New Roman" w:cs="Times New Roman"/>
-                <w:b w:val="0"/>
-                <w:bCs w:val="0"/>
-                <w:i w:val="0"/>
-                <w:iCs w:val="0"/>
-                <w:caps w:val="0"/>
-                <w:smallCaps w:val="0"/>
-                <w:noProof w:val="0"/>
-                <w:color w:val="000000" w:themeColor="text1" w:themeTint="FF" w:themeShade="FF"/>
-                <w:sz w:val="18"/>
-                <w:szCs w:val="18"/>
-                <w:lang w:val="en-GB"/>
-              </w:rPr>
-              <w:t>required</w:t>
-            </w:r>
-            <w:r>
-              <w:rPr>
-                <w:rFonts w:ascii="Times New Roman" w:hAnsi="Times New Roman" w:eastAsia="Times New Roman" w:cs="Times New Roman"/>
-                <w:b w:val="0"/>
-                <w:bCs w:val="0"/>
-                <w:i w:val="0"/>
-                <w:iCs w:val="0"/>
-                <w:caps w:val="0"/>
-                <w:smallCaps w:val="0"/>
-                <w:noProof w:val="0"/>
-                <w:color w:val="000000" w:themeColor="text1" w:themeTint="FF" w:themeShade="FF"/>
-                <w:sz w:val="18"/>
-                <w:szCs w:val="18"/>
-                <w:lang w:val="en-GB"/>
-              </w:rPr>
-              <w:t>)</w:t>
-            </w:r>
-          </w:p>
-          <w:p>
-            <w:pPr>
-              <w:pStyle w:val="Normal"/>
-              <w:shd w:val="clear" w:color="auto" w:fill="FFFFFF" w:themeFill="background1"/>
-              <w:spacing w:before="0" w:beforeAutospacing="off" w:after="0" w:afterAutospacing="off" w:line="360" w:lineRule="auto"/>
-              <w:rPr>
-                <w:rFonts w:ascii="Times New Roman" w:hAnsi="Times New Roman" w:eastAsia="Times New Roman" w:cs="Times New Roman"/>
-                <w:b w:val="0"/>
-                <w:bCs w:val="0"/>
-                <w:i w:val="0"/>
-                <w:iCs w:val="0"/>
-                <w:caps w:val="0"/>
-                <w:smallCaps w:val="0"/>
-                <w:noProof w:val="0"/>
-                <w:color w:val="000000" w:themeColor="text1" w:themeTint="FF" w:themeShade="FF"/>
-                <w:sz w:val="18"/>
-                <w:szCs w:val="18"/>
-                <w:lang w:val="en-GB"/>
-              </w:rPr>
-            </w:pPr>
-            <w:r>
-              <w:rPr>
-                <w:rFonts w:ascii="Times New Roman" w:hAnsi="Times New Roman" w:eastAsia="Times New Roman" w:cs="Times New Roman"/>
-                <w:b w:val="0"/>
-                <w:bCs w:val="0"/>
-                <w:i w:val="0"/>
-                <w:iCs w:val="0"/>
-                <w:caps w:val="0"/>
-                <w:smallCaps w:val="0"/>
-                <w:noProof w:val="0"/>
-                <w:color w:val="000000" w:themeColor="text1" w:themeTint="FF" w:themeShade="FF"/>
-                <w:sz w:val="18"/>
-                <w:szCs w:val="18"/>
-                <w:lang w:val="en-GB"/>
-              </w:rPr>
-              <w:t xml:space="preserve">{{ </w:t>
-            </w:r>
-            <w:r>
-              <w:rPr>
-                <w:rFonts w:ascii="Times New Roman" w:hAnsi="Times New Roman" w:eastAsia="Times New Roman" w:cs="Times New Roman"/>
-                <w:b w:val="0"/>
-                <w:bCs w:val="0"/>
-                <w:i w:val="0"/>
-                <w:iCs w:val="0"/>
-                <w:caps w:val="0"/>
-                <w:smallCaps w:val="0"/>
-                <w:noProof w:val="0"/>
-                <w:color w:val="000000" w:themeColor="text1" w:themeTint="FF" w:themeShade="FF"/>
-                <w:sz w:val="18"/>
-                <w:szCs w:val="18"/>
-                <w:lang w:val="en-GB"/>
-              </w:rPr>
-              <w:t>output_checkbox</w:t>
-            </w:r>
-            <w:r>
-              <w:rPr>
-                <w:rFonts w:ascii="Times New Roman" w:hAnsi="Times New Roman" w:eastAsia="Times New Roman" w:cs="Times New Roman"/>
-                <w:b w:val="0"/>
-                <w:bCs w:val="0"/>
-                <w:i w:val="0"/>
-                <w:iCs w:val="0"/>
-                <w:caps w:val="0"/>
-                <w:smallCaps w:val="0"/>
-                <w:noProof w:val="0"/>
-                <w:color w:val="000000" w:themeColor="text1" w:themeTint="FF" w:themeShade="FF"/>
-                <w:sz w:val="18"/>
-                <w:szCs w:val="18"/>
-                <w:lang w:val="en-GB"/>
-              </w:rPr>
-              <w:t>(issue_</w:t>
-            </w:r>
-            <w:r>
-              <w:rPr>
-                <w:rFonts w:ascii="Times New Roman" w:hAnsi="Times New Roman" w:eastAsia="Times New Roman" w:cs="Times New Roman"/>
-                <w:b w:val="0"/>
-                <w:bCs w:val="0"/>
-                <w:i w:val="0"/>
-                <w:iCs w:val="0"/>
-                <w:caps w:val="0"/>
-                <w:smallCaps w:val="0"/>
-                <w:noProof w:val="0"/>
-                <w:color w:val="000000" w:themeColor="text1" w:themeTint="FF" w:themeShade="FF"/>
-                <w:sz w:val="18"/>
-                <w:szCs w:val="18"/>
-                <w:lang w:val="en-GB"/>
-              </w:rPr>
-              <w:t>son</w:t>
-            </w:r>
-            <w:r>
-              <w:rPr>
-                <w:rFonts w:ascii="Times New Roman" w:hAnsi="Times New Roman" w:eastAsia="Times New Roman" w:cs="Times New Roman"/>
-                <w:b w:val="0"/>
-                <w:bCs w:val="0"/>
-                <w:i w:val="0"/>
-                <w:iCs w:val="0"/>
-                <w:caps w:val="0"/>
-                <w:smallCaps w:val="0"/>
-                <w:noProof w:val="0"/>
-                <w:color w:val="000000" w:themeColor="text1" w:themeTint="FF" w:themeShade="FF"/>
-                <w:sz w:val="18"/>
-                <w:szCs w:val="18"/>
-                <w:lang w:val="en-GB"/>
-              </w:rPr>
-              <w:t xml:space="preserve">) }} </w:t>
-            </w:r>
-            <w:r>
-              <w:rPr>
-                <w:rFonts w:ascii="Times New Roman" w:hAnsi="Times New Roman" w:eastAsia="Times New Roman" w:cs="Times New Roman"/>
-                <w:b w:val="0"/>
-                <w:bCs w:val="0"/>
-                <w:i w:val="0"/>
-                <w:iCs w:val="0"/>
-                <w:caps w:val="0"/>
-                <w:smallCaps w:val="0"/>
-                <w:noProof w:val="0"/>
-                <w:color w:val="000000" w:themeColor="text1" w:themeTint="FF" w:themeShade="FF"/>
-                <w:sz w:val="18"/>
-                <w:szCs w:val="18"/>
-                <w:lang w:val="en-GB"/>
-              </w:rPr>
-              <w:t>Issue a Short Order of Notice (a shortened notice period to the other side so the Court can hear this request)</w:t>
+              <w:t xml:space="preserve">{{ output_checkbox(issue_son) }} Issue a Short Order of Notice (a shortened notice period to the other side so the Court can hear this request)</w:t>
             </w:r>
           </w:p>
         </w:tc>
@@ -3441,109 +1686,7 @@
                 <w:szCs w:val="18"/>
                 <w:lang w:val="en-GB"/>
               </w:rPr>
-              <w:t xml:space="preserve">I have personal knowledge of </w:t>
-            </w:r>
-            <w:r>
-              <w:rPr>
-                <w:rFonts w:ascii="Times New Roman" w:hAnsi="Times New Roman" w:eastAsia="Times New Roman" w:cs="Times New Roman"/>
-                <w:b w:val="0"/>
-                <w:bCs w:val="0"/>
-                <w:i w:val="0"/>
-                <w:iCs w:val="0"/>
-                <w:caps w:val="0"/>
-                <w:smallCaps w:val="0"/>
-                <w:noProof w:val="0"/>
-                <w:color w:val="000000" w:themeColor="text1" w:themeTint="FF" w:themeShade="FF"/>
-                <w:sz w:val="18"/>
-                <w:szCs w:val="18"/>
-                <w:lang w:val="en-GB"/>
-              </w:rPr>
-              <w:t>all of</w:t>
-            </w:r>
-            <w:r>
-              <w:rPr>
-                <w:rFonts w:ascii="Times New Roman" w:hAnsi="Times New Roman" w:eastAsia="Times New Roman" w:cs="Times New Roman"/>
-                <w:b w:val="0"/>
-                <w:bCs w:val="0"/>
-                <w:i w:val="0"/>
-                <w:iCs w:val="0"/>
-                <w:caps w:val="0"/>
-                <w:smallCaps w:val="0"/>
-                <w:noProof w:val="0"/>
-                <w:color w:val="000000" w:themeColor="text1" w:themeTint="FF" w:themeShade="FF"/>
-                <w:sz w:val="18"/>
-                <w:szCs w:val="18"/>
-                <w:lang w:val="en-GB"/>
-              </w:rPr>
-              <w:t xml:space="preserve"> the facts </w:t>
-            </w:r>
-            <w:r>
-              <w:rPr>
-                <w:rFonts w:ascii="Times New Roman" w:hAnsi="Times New Roman" w:eastAsia="Times New Roman" w:cs="Times New Roman"/>
-                <w:b w:val="0"/>
-                <w:bCs w:val="0"/>
-                <w:i w:val="0"/>
-                <w:iCs w:val="0"/>
-                <w:caps w:val="0"/>
-                <w:smallCaps w:val="0"/>
-                <w:noProof w:val="0"/>
-                <w:color w:val="000000" w:themeColor="text1" w:themeTint="FF" w:themeShade="FF"/>
-                <w:sz w:val="18"/>
-                <w:szCs w:val="18"/>
-                <w:lang w:val="en-GB"/>
-              </w:rPr>
-              <w:t>stated</w:t>
-            </w:r>
-            <w:r>
-              <w:rPr>
-                <w:rFonts w:ascii="Times New Roman" w:hAnsi="Times New Roman" w:eastAsia="Times New Roman" w:cs="Times New Roman"/>
-                <w:b w:val="0"/>
-                <w:bCs w:val="0"/>
-                <w:i w:val="0"/>
-                <w:iCs w:val="0"/>
-                <w:caps w:val="0"/>
-                <w:smallCaps w:val="0"/>
-                <w:noProof w:val="0"/>
-                <w:color w:val="000000" w:themeColor="text1" w:themeTint="FF" w:themeShade="FF"/>
-                <w:sz w:val="18"/>
-                <w:szCs w:val="18"/>
-                <w:lang w:val="en-GB"/>
-              </w:rPr>
-              <w:t xml:space="preserve"> above and hereby swear under the penalties of perjury those facts are true and </w:t>
-            </w:r>
-            <w:r>
-              <w:rPr>
-                <w:rFonts w:ascii="Times New Roman" w:hAnsi="Times New Roman" w:eastAsia="Times New Roman" w:cs="Times New Roman"/>
-                <w:b w:val="0"/>
-                <w:bCs w:val="0"/>
-                <w:i w:val="0"/>
-                <w:iCs w:val="0"/>
-                <w:caps w:val="0"/>
-                <w:smallCaps w:val="0"/>
-                <w:noProof w:val="0"/>
-                <w:color w:val="000000" w:themeColor="text1" w:themeTint="FF" w:themeShade="FF"/>
-                <w:sz w:val="18"/>
-                <w:szCs w:val="18"/>
-                <w:lang w:val="en-GB"/>
-              </w:rPr>
-              <w:t>accurate</w:t>
-            </w:r>
-            <w:r>
-              <w:rPr>
-                <w:rFonts w:ascii="Times New Roman" w:hAnsi="Times New Roman" w:eastAsia="Times New Roman" w:cs="Times New Roman"/>
-                <w:b w:val="0"/>
-                <w:bCs w:val="0"/>
-                <w:i w:val="0"/>
-                <w:iCs w:val="0"/>
-                <w:caps w:val="0"/>
-                <w:smallCaps w:val="0"/>
-                <w:noProof w:val="0"/>
-                <w:color w:val="000000" w:themeColor="text1" w:themeTint="FF" w:themeShade="FF"/>
-                <w:sz w:val="18"/>
-                <w:szCs w:val="18"/>
-                <w:lang w:val="en-GB"/>
-              </w:rPr>
-              <w:t>:</w:t>
+              <w:t xml:space="preserve">I have personal knowledge of all of the facts stated above and hereby swear under the penalties of perjury those facts are true and accurate:</w:t>
             </w:r>
           </w:p>
         </w:tc>
@@ -3667,15 +1810,7 @@
                 <w:sz w:val="18"/>
                 <w:szCs w:val="18"/>
               </w:rPr>
-              <w:t xml:space="preserve">Date: </w:t>
-            </w:r>
-            <w:r>
-              <w:rPr>
-                <w:rFonts w:ascii="Times New Roman" w:hAnsi="Times New Roman" w:eastAsia="Times New Roman" w:cs="Times New Roman"/>
-                <w:sz w:val="18"/>
-                <w:szCs w:val="18"/>
-              </w:rPr>
-              <w:t xml:space="preserve">{{ </w:t>
+              <w:t xml:space="preserve">Date: {{ </w:t>
             </w:r>
             <w:r>
               <w:rPr>

</xml_diff>